<commit_message>
Weekly to-do: add emojis and pastel section colors
Co-Authored-By: Claude Opus 5.5 <noreply@anthropic.com>
</commit_message>
<xml_diff>
--- a/Weekly-Todo-2026-10-26.docx
+++ b/Weekly-Todo-2026-10-26.docx
@@ -6,51 +6,96 @@
       <w:pPr>
         <w:pStyle w:val="Heading1"/>
         <w:rPr>
-          <w:rFonts w:ascii="Calibri" w:eastAsia="Times New Roman" w:hAnsi="Calibri" w:cs="Calibri"/>
-        </w:rPr>
-      </w:pPr>
-      <w:r>
-        <w:rPr>
-          <w:rFonts w:ascii="Calibri" w:eastAsia="Times New Roman" w:hAnsi="Calibri" w:cs="Calibri"/>
-        </w:rPr>
-        <w:t>This week: Change Request Portal</w:t>
-      </w:r>
-    </w:p>
-    <w:p>
-      <w:pPr>
-        <w:pStyle w:val="sub"/>
-        <w:rPr>
-          <w:rFonts w:ascii="Calibri" w:hAnsi="Calibri" w:cs="Calibri"/>
-          <w:sz w:val="22"/>
-          <w:szCs w:val="22"/>
-        </w:rPr>
-      </w:pPr>
-      <w:r>
-        <w:rPr>
-          <w:rFonts w:ascii="Calibri" w:hAnsi="Calibri" w:cs="Calibri"/>
-          <w:sz w:val="22"/>
-          <w:szCs w:val="22"/>
-        </w:rPr>
-        <w:t>Week of Oct 26–30, 2026</w:t>
+          <w:rFonts w:ascii="Segoe UI" w:eastAsia="Times New Roman" w:hAnsi="Segoe UI" w:cs="Segoe UI"/>
+        </w:rPr>
+      </w:pPr>
+      <w:r>
+        <w:rPr>
+          <w:rFonts w:ascii="Segoe UI Emoji" w:eastAsia="Times New Roman" w:hAnsi="Segoe UI Emoji" w:cs="Segoe UI Emoji"/>
+        </w:rPr>
+        <w:t>🌸</w:t>
+      </w:r>
+      <w:r>
+        <w:rPr>
+          <w:rFonts w:ascii="Segoe UI" w:eastAsia="Times New Roman" w:hAnsi="Segoe UI" w:cs="Segoe UI"/>
+        </w:rPr>
+        <w:t xml:space="preserve"> This Week: Change Request Portal </w:t>
+      </w:r>
+      <w:r>
+        <w:rPr>
+          <w:rFonts w:ascii="Segoe UI Emoji" w:eastAsia="Times New Roman" w:hAnsi="Segoe UI Emoji" w:cs="Segoe UI Emoji"/>
+        </w:rPr>
+        <w:t>✨</w:t>
+      </w:r>
+    </w:p>
+    <w:p>
+      <w:pPr>
+        <w:pStyle w:val="tag"/>
+        <w:rPr>
+          <w:rFonts w:ascii="Segoe UI" w:hAnsi="Segoe UI" w:cs="Segoe UI"/>
+          <w:sz w:val="22"/>
+          <w:szCs w:val="22"/>
+        </w:rPr>
+      </w:pPr>
+      <w:r>
+        <w:rPr>
+          <w:rFonts w:ascii="Segoe UI Emoji" w:hAnsi="Segoe UI Emoji" w:cs="Segoe UI Emoji"/>
+          <w:sz w:val="22"/>
+          <w:szCs w:val="22"/>
+        </w:rPr>
+        <w:t>📅</w:t>
+      </w:r>
+      <w:r>
+        <w:rPr>
+          <w:rFonts w:ascii="Segoe UI" w:hAnsi="Segoe UI" w:cs="Segoe UI"/>
+          <w:sz w:val="22"/>
+          <w:szCs w:val="22"/>
+        </w:rPr>
+        <w:t xml:space="preserve"> Week of Oct 26–30, 2026 · you've got this! </w:t>
+      </w:r>
+      <w:r>
+        <w:rPr>
+          <w:rFonts w:ascii="Segoe UI Emoji" w:hAnsi="Segoe UI Emoji" w:cs="Segoe UI Emoji"/>
+          <w:sz w:val="22"/>
+          <w:szCs w:val="22"/>
+        </w:rPr>
+        <w:t>💪</w:t>
       </w:r>
     </w:p>
     <w:p>
       <w:pPr>
         <w:pStyle w:val="Heading2"/>
-        <w:rPr>
-          <w:rFonts w:ascii="Calibri" w:eastAsia="Times New Roman" w:hAnsi="Calibri" w:cs="Calibri"/>
-        </w:rPr>
-      </w:pPr>
-      <w:r>
-        <w:rPr>
-          <w:rFonts w:ascii="Calibri" w:eastAsia="Times New Roman" w:hAnsi="Calibri" w:cs="Calibri"/>
-        </w:rPr>
-        <w:t xml:space="preserve">1. Implement the notes tabs update </w:t>
+        <w:shd w:val="clear" w:color="auto" w:fill="FDE2EC"/>
+        <w:rPr>
+          <w:rFonts w:ascii="Segoe UI" w:eastAsia="Times New Roman" w:hAnsi="Segoe UI" w:cs="Segoe UI"/>
+          <w:color w:val="C2185B"/>
+        </w:rPr>
+      </w:pPr>
+      <w:r>
+        <w:rPr>
+          <w:rFonts w:ascii="Segoe UI Emoji" w:eastAsia="Times New Roman" w:hAnsi="Segoe UI Emoji" w:cs="Segoe UI Emoji"/>
+          <w:color w:val="C2185B"/>
+        </w:rPr>
+        <w:t>🛠</w:t>
+      </w:r>
+      <w:r>
+        <w:rPr>
+          <w:rFonts w:ascii="Segoe UI Emoji" w:eastAsia="Times New Roman" w:hAnsi="Segoe UI Emoji" w:cs="Segoe UI Emoji"/>
+          <w:color w:val="C2185B"/>
+        </w:rPr>
+        <w:t>️</w:t>
+      </w:r>
+      <w:r>
+        <w:rPr>
+          <w:rFonts w:ascii="Segoe UI" w:eastAsia="Times New Roman" w:hAnsi="Segoe UI" w:cs="Segoe UI"/>
+          <w:color w:val="C2185B"/>
+        </w:rPr>
+        <w:t xml:space="preserve"> 1. Implement the notes tabs update </w:t>
       </w:r>
       <w:r>
         <w:rPr>
           <w:rStyle w:val="sub1"/>
-          <w:rFonts w:ascii="Calibri" w:eastAsia="Times New Roman" w:hAnsi="Calibri" w:cs="Calibri"/>
+          <w:rFonts w:ascii="Segoe UI" w:eastAsia="Times New Roman" w:hAnsi="Segoe UI" w:cs="Segoe UI"/>
           <w:b w:val="0"/>
           <w:bCs w:val="0"/>
         </w:rPr>
@@ -61,22 +106,25 @@
       <w:pPr>
         <w:pStyle w:val="t"/>
         <w:rPr>
-          <w:rFonts w:ascii="Calibri" w:hAnsi="Calibri" w:cs="Calibri"/>
-          <w:sz w:val="22"/>
-          <w:szCs w:val="22"/>
-        </w:rPr>
-      </w:pPr>
-      <w:r>
-        <w:rPr>
-          <w:rFonts w:ascii="Segoe UI Symbol" w:hAnsi="Segoe UI Symbol" w:cs="Segoe UI Symbol"/>
-          <w:sz w:val="22"/>
-          <w:szCs w:val="22"/>
-        </w:rPr>
-        <w:t>☐</w:t>
-      </w:r>
-      <w:r>
-        <w:rPr>
-          <w:rFonts w:ascii="Calibri" w:hAnsi="Calibri" w:cs="Calibri"/>
+          <w:rFonts w:ascii="Segoe UI" w:hAnsi="Segoe UI" w:cs="Segoe UI"/>
+          <w:color w:val="3D3550"/>
+          <w:sz w:val="22"/>
+          <w:szCs w:val="22"/>
+        </w:rPr>
+      </w:pPr>
+      <w:r>
+        <w:rPr>
+          <w:rFonts w:ascii="Segoe UI Symbol" w:hAnsi="Segoe UI Symbol" w:cs="Segoe UI Symbol"/>
+          <w:color w:val="3D3550"/>
+          <w:sz w:val="22"/>
+          <w:szCs w:val="22"/>
+        </w:rPr>
+        <w:t>☐</w:t>
+      </w:r>
+      <w:r>
+        <w:rPr>
+          <w:rFonts w:ascii="Segoe UI" w:hAnsi="Segoe UI" w:cs="Segoe UI"/>
+          <w:color w:val="3D3550"/>
           <w:sz w:val="22"/>
           <w:szCs w:val="22"/>
         </w:rPr>
@@ -87,22 +135,25 @@
       <w:pPr>
         <w:pStyle w:val="t"/>
         <w:rPr>
-          <w:rFonts w:ascii="Calibri" w:hAnsi="Calibri" w:cs="Calibri"/>
-          <w:sz w:val="22"/>
-          <w:szCs w:val="22"/>
-        </w:rPr>
-      </w:pPr>
-      <w:r>
-        <w:rPr>
-          <w:rFonts w:ascii="Segoe UI Symbol" w:hAnsi="Segoe UI Symbol" w:cs="Segoe UI Symbol"/>
-          <w:sz w:val="22"/>
-          <w:szCs w:val="22"/>
-        </w:rPr>
-        <w:t>☐</w:t>
-      </w:r>
-      <w:r>
-        <w:rPr>
-          <w:rFonts w:ascii="Calibri" w:hAnsi="Calibri" w:cs="Calibri"/>
+          <w:rFonts w:ascii="Segoe UI" w:hAnsi="Segoe UI" w:cs="Segoe UI"/>
+          <w:color w:val="3D3550"/>
+          <w:sz w:val="22"/>
+          <w:szCs w:val="22"/>
+        </w:rPr>
+      </w:pPr>
+      <w:r>
+        <w:rPr>
+          <w:rFonts w:ascii="Segoe UI Symbol" w:hAnsi="Segoe UI Symbol" w:cs="Segoe UI Symbol"/>
+          <w:color w:val="3D3550"/>
+          <w:sz w:val="22"/>
+          <w:szCs w:val="22"/>
+        </w:rPr>
+        <w:t>☐</w:t>
+      </w:r>
+      <w:r>
+        <w:rPr>
+          <w:rFonts w:ascii="Segoe UI" w:hAnsi="Segoe UI" w:cs="Segoe UI"/>
+          <w:color w:val="3D3550"/>
           <w:sz w:val="22"/>
           <w:szCs w:val="22"/>
         </w:rPr>
@@ -113,22 +164,25 @@
       <w:pPr>
         <w:pStyle w:val="t"/>
         <w:rPr>
-          <w:rFonts w:ascii="Calibri" w:hAnsi="Calibri" w:cs="Calibri"/>
-          <w:sz w:val="22"/>
-          <w:szCs w:val="22"/>
-        </w:rPr>
-      </w:pPr>
-      <w:r>
-        <w:rPr>
-          <w:rFonts w:ascii="Segoe UI Symbol" w:hAnsi="Segoe UI Symbol" w:cs="Segoe UI Symbol"/>
-          <w:sz w:val="22"/>
-          <w:szCs w:val="22"/>
-        </w:rPr>
-        <w:t>☐</w:t>
-      </w:r>
-      <w:r>
-        <w:rPr>
-          <w:rFonts w:ascii="Calibri" w:hAnsi="Calibri" w:cs="Calibri"/>
+          <w:rFonts w:ascii="Segoe UI" w:hAnsi="Segoe UI" w:cs="Segoe UI"/>
+          <w:color w:val="3D3550"/>
+          <w:sz w:val="22"/>
+          <w:szCs w:val="22"/>
+        </w:rPr>
+      </w:pPr>
+      <w:r>
+        <w:rPr>
+          <w:rFonts w:ascii="Segoe UI Symbol" w:hAnsi="Segoe UI Symbol" w:cs="Segoe UI Symbol"/>
+          <w:color w:val="3D3550"/>
+          <w:sz w:val="22"/>
+          <w:szCs w:val="22"/>
+        </w:rPr>
+        <w:t>☐</w:t>
+      </w:r>
+      <w:r>
+        <w:rPr>
+          <w:rFonts w:ascii="Segoe UI" w:hAnsi="Segoe UI" w:cs="Segoe UI"/>
+          <w:color w:val="3D3550"/>
           <w:sz w:val="22"/>
           <w:szCs w:val="22"/>
         </w:rPr>
@@ -139,22 +193,25 @@
       <w:pPr>
         <w:pStyle w:val="t"/>
         <w:rPr>
-          <w:rFonts w:ascii="Calibri" w:hAnsi="Calibri" w:cs="Calibri"/>
-          <w:sz w:val="22"/>
-          <w:szCs w:val="22"/>
-        </w:rPr>
-      </w:pPr>
-      <w:r>
-        <w:rPr>
-          <w:rFonts w:ascii="Segoe UI Symbol" w:hAnsi="Segoe UI Symbol" w:cs="Segoe UI Symbol"/>
-          <w:sz w:val="22"/>
-          <w:szCs w:val="22"/>
-        </w:rPr>
-        <w:t>☐</w:t>
-      </w:r>
-      <w:r>
-        <w:rPr>
-          <w:rFonts w:ascii="Calibri" w:hAnsi="Calibri" w:cs="Calibri"/>
+          <w:rFonts w:ascii="Segoe UI" w:hAnsi="Segoe UI" w:cs="Segoe UI"/>
+          <w:color w:val="3D3550"/>
+          <w:sz w:val="22"/>
+          <w:szCs w:val="22"/>
+        </w:rPr>
+      </w:pPr>
+      <w:r>
+        <w:rPr>
+          <w:rFonts w:ascii="Segoe UI Symbol" w:hAnsi="Segoe UI Symbol" w:cs="Segoe UI Symbol"/>
+          <w:color w:val="3D3550"/>
+          <w:sz w:val="22"/>
+          <w:szCs w:val="22"/>
+        </w:rPr>
+        <w:t>☐</w:t>
+      </w:r>
+      <w:r>
+        <w:rPr>
+          <w:rFonts w:ascii="Segoe UI" w:hAnsi="Segoe UI" w:cs="Segoe UI"/>
+          <w:color w:val="3D3550"/>
           <w:sz w:val="22"/>
           <w:szCs w:val="22"/>
         </w:rPr>
@@ -165,22 +222,25 @@
       <w:pPr>
         <w:pStyle w:val="t"/>
         <w:rPr>
-          <w:rFonts w:ascii="Calibri" w:hAnsi="Calibri" w:cs="Calibri"/>
-          <w:sz w:val="22"/>
-          <w:szCs w:val="22"/>
-        </w:rPr>
-      </w:pPr>
-      <w:r>
-        <w:rPr>
-          <w:rFonts w:ascii="Segoe UI Symbol" w:hAnsi="Segoe UI Symbol" w:cs="Segoe UI Symbol"/>
-          <w:sz w:val="22"/>
-          <w:szCs w:val="22"/>
-        </w:rPr>
-        <w:t>☐</w:t>
-      </w:r>
-      <w:r>
-        <w:rPr>
-          <w:rFonts w:ascii="Calibri" w:hAnsi="Calibri" w:cs="Calibri"/>
+          <w:rFonts w:ascii="Segoe UI" w:hAnsi="Segoe UI" w:cs="Segoe UI"/>
+          <w:color w:val="3D3550"/>
+          <w:sz w:val="22"/>
+          <w:szCs w:val="22"/>
+        </w:rPr>
+      </w:pPr>
+      <w:r>
+        <w:rPr>
+          <w:rFonts w:ascii="Segoe UI Symbol" w:hAnsi="Segoe UI Symbol" w:cs="Segoe UI Symbol"/>
+          <w:color w:val="3D3550"/>
+          <w:sz w:val="22"/>
+          <w:szCs w:val="22"/>
+        </w:rPr>
+        <w:t>☐</w:t>
+      </w:r>
+      <w:r>
+        <w:rPr>
+          <w:rFonts w:ascii="Segoe UI" w:hAnsi="Segoe UI" w:cs="Segoe UI"/>
+          <w:color w:val="3D3550"/>
           <w:sz w:val="22"/>
           <w:szCs w:val="22"/>
         </w:rPr>
@@ -191,22 +251,25 @@
       <w:pPr>
         <w:pStyle w:val="t"/>
         <w:rPr>
-          <w:rFonts w:ascii="Calibri" w:hAnsi="Calibri" w:cs="Calibri"/>
-          <w:sz w:val="22"/>
-          <w:szCs w:val="22"/>
-        </w:rPr>
-      </w:pPr>
-      <w:r>
-        <w:rPr>
-          <w:rFonts w:ascii="Segoe UI Symbol" w:hAnsi="Segoe UI Symbol" w:cs="Segoe UI Symbol"/>
-          <w:sz w:val="22"/>
-          <w:szCs w:val="22"/>
-        </w:rPr>
-        <w:t>☐</w:t>
-      </w:r>
-      <w:r>
-        <w:rPr>
-          <w:rFonts w:ascii="Calibri" w:hAnsi="Calibri" w:cs="Calibri"/>
+          <w:rFonts w:ascii="Segoe UI" w:hAnsi="Segoe UI" w:cs="Segoe UI"/>
+          <w:color w:val="3D3550"/>
+          <w:sz w:val="22"/>
+          <w:szCs w:val="22"/>
+        </w:rPr>
+      </w:pPr>
+      <w:r>
+        <w:rPr>
+          <w:rFonts w:ascii="Segoe UI Symbol" w:hAnsi="Segoe UI Symbol" w:cs="Segoe UI Symbol"/>
+          <w:color w:val="3D3550"/>
+          <w:sz w:val="22"/>
+          <w:szCs w:val="22"/>
+        </w:rPr>
+        <w:t>☐</w:t>
+      </w:r>
+      <w:r>
+        <w:rPr>
+          <w:rFonts w:ascii="Segoe UI" w:hAnsi="Segoe UI" w:cs="Segoe UI"/>
+          <w:color w:val="3D3550"/>
           <w:sz w:val="22"/>
           <w:szCs w:val="22"/>
         </w:rPr>
@@ -217,22 +280,25 @@
       <w:pPr>
         <w:pStyle w:val="t"/>
         <w:rPr>
-          <w:rFonts w:ascii="Calibri" w:hAnsi="Calibri" w:cs="Calibri"/>
-          <w:sz w:val="22"/>
-          <w:szCs w:val="22"/>
-        </w:rPr>
-      </w:pPr>
-      <w:r>
-        <w:rPr>
-          <w:rFonts w:ascii="Segoe UI Symbol" w:hAnsi="Segoe UI Symbol" w:cs="Segoe UI Symbol"/>
-          <w:sz w:val="22"/>
-          <w:szCs w:val="22"/>
-        </w:rPr>
-        <w:t>☐</w:t>
-      </w:r>
-      <w:r>
-        <w:rPr>
-          <w:rFonts w:ascii="Calibri" w:hAnsi="Calibri" w:cs="Calibri"/>
+          <w:rFonts w:ascii="Segoe UI" w:hAnsi="Segoe UI" w:cs="Segoe UI"/>
+          <w:color w:val="3D3550"/>
+          <w:sz w:val="22"/>
+          <w:szCs w:val="22"/>
+        </w:rPr>
+      </w:pPr>
+      <w:r>
+        <w:rPr>
+          <w:rFonts w:ascii="Segoe UI Symbol" w:hAnsi="Segoe UI Symbol" w:cs="Segoe UI Symbol"/>
+          <w:color w:val="3D3550"/>
+          <w:sz w:val="22"/>
+          <w:szCs w:val="22"/>
+        </w:rPr>
+        <w:t>☐</w:t>
+      </w:r>
+      <w:r>
+        <w:rPr>
+          <w:rFonts w:ascii="Segoe UI" w:hAnsi="Segoe UI" w:cs="Segoe UI"/>
+          <w:color w:val="3D3550"/>
           <w:sz w:val="22"/>
           <w:szCs w:val="22"/>
         </w:rPr>
@@ -243,22 +309,25 @@
       <w:pPr>
         <w:pStyle w:val="t"/>
         <w:rPr>
-          <w:rFonts w:ascii="Calibri" w:hAnsi="Calibri" w:cs="Calibri"/>
-          <w:sz w:val="22"/>
-          <w:szCs w:val="22"/>
-        </w:rPr>
-      </w:pPr>
-      <w:r>
-        <w:rPr>
-          <w:rFonts w:ascii="Segoe UI Symbol" w:hAnsi="Segoe UI Symbol" w:cs="Segoe UI Symbol"/>
-          <w:sz w:val="22"/>
-          <w:szCs w:val="22"/>
-        </w:rPr>
-        <w:t>☐</w:t>
-      </w:r>
-      <w:r>
-        <w:rPr>
-          <w:rFonts w:ascii="Calibri" w:hAnsi="Calibri" w:cs="Calibri"/>
+          <w:rFonts w:ascii="Segoe UI" w:hAnsi="Segoe UI" w:cs="Segoe UI"/>
+          <w:color w:val="3D3550"/>
+          <w:sz w:val="22"/>
+          <w:szCs w:val="22"/>
+        </w:rPr>
+      </w:pPr>
+      <w:r>
+        <w:rPr>
+          <w:rFonts w:ascii="Segoe UI Symbol" w:hAnsi="Segoe UI Symbol" w:cs="Segoe UI Symbol"/>
+          <w:color w:val="3D3550"/>
+          <w:sz w:val="22"/>
+          <w:szCs w:val="22"/>
+        </w:rPr>
+        <w:t>☐</w:t>
+      </w:r>
+      <w:r>
+        <w:rPr>
+          <w:rFonts w:ascii="Segoe UI" w:hAnsi="Segoe UI" w:cs="Segoe UI"/>
+          <w:color w:val="3D3550"/>
           <w:sz w:val="22"/>
           <w:szCs w:val="22"/>
         </w:rPr>
@@ -269,22 +338,43 @@
       <w:pPr>
         <w:pStyle w:val="t"/>
         <w:rPr>
-          <w:rFonts w:ascii="Calibri" w:hAnsi="Calibri" w:cs="Calibri"/>
-          <w:sz w:val="22"/>
-          <w:szCs w:val="22"/>
-        </w:rPr>
-      </w:pPr>
-      <w:r>
-        <w:rPr>
-          <w:rFonts w:ascii="Segoe UI Symbol" w:hAnsi="Segoe UI Symbol" w:cs="Segoe UI Symbol"/>
-          <w:sz w:val="22"/>
-          <w:szCs w:val="22"/>
-        </w:rPr>
-        <w:t>☐</w:t>
-      </w:r>
-      <w:r>
-        <w:rPr>
-          <w:rFonts w:ascii="Calibri" w:hAnsi="Calibri" w:cs="Calibri"/>
+          <w:rFonts w:ascii="Segoe UI" w:hAnsi="Segoe UI" w:cs="Segoe UI"/>
+          <w:color w:val="3D3550"/>
+          <w:sz w:val="22"/>
+          <w:szCs w:val="22"/>
+        </w:rPr>
+      </w:pPr>
+      <w:r>
+        <w:rPr>
+          <w:rFonts w:ascii="Segoe UI Symbol" w:hAnsi="Segoe UI Symbol" w:cs="Segoe UI Symbol"/>
+          <w:color w:val="3D3550"/>
+          <w:sz w:val="22"/>
+          <w:szCs w:val="22"/>
+        </w:rPr>
+        <w:t>☐</w:t>
+      </w:r>
+      <w:r>
+        <w:rPr>
+          <w:rFonts w:ascii="Segoe UI" w:hAnsi="Segoe UI" w:cs="Segoe UI"/>
+          <w:color w:val="3D3550"/>
+          <w:sz w:val="22"/>
+          <w:szCs w:val="22"/>
+        </w:rPr>
+        <w:t xml:space="preserve"> </w:t>
+      </w:r>
+      <w:r>
+        <w:rPr>
+          <w:rFonts w:ascii="Segoe UI Emoji" w:hAnsi="Segoe UI Emoji" w:cs="Segoe UI Emoji"/>
+          <w:color w:val="3D3550"/>
+          <w:sz w:val="22"/>
+          <w:szCs w:val="22"/>
+        </w:rPr>
+        <w:t>🧪</w:t>
+      </w:r>
+      <w:r>
+        <w:rPr>
+          <w:rFonts w:ascii="Segoe UI" w:hAnsi="Segoe UI" w:cs="Segoe UI"/>
+          <w:color w:val="3D3550"/>
           <w:sz w:val="22"/>
           <w:szCs w:val="22"/>
         </w:rPr>
@@ -294,37 +384,50 @@
     <w:p>
       <w:pPr>
         <w:pStyle w:val="Heading2"/>
-        <w:rPr>
-          <w:rFonts w:ascii="Calibri" w:eastAsia="Times New Roman" w:hAnsi="Calibri" w:cs="Calibri"/>
-        </w:rPr>
-      </w:pPr>
-      <w:r>
-        <w:rPr>
-          <w:rFonts w:ascii="Calibri" w:eastAsia="Times New Roman" w:hAnsi="Calibri" w:cs="Calibri"/>
-        </w:rPr>
-        <w:t>2. Add the changes from Friday's meeting</w:t>
-      </w:r>
-    </w:p>
-    <w:p>
-      <w:pPr>
-        <w:pStyle w:val="t"/>
-        <w:rPr>
-          <w:rFonts w:ascii="Calibri" w:hAnsi="Calibri" w:cs="Calibri"/>
-          <w:sz w:val="22"/>
-          <w:szCs w:val="22"/>
-        </w:rPr>
-      </w:pPr>
-      <w:r>
-        <w:rPr>
-          <w:rFonts w:ascii="Segoe UI Symbol" w:hAnsi="Segoe UI Symbol" w:cs="Segoe UI Symbol"/>
-          <w:sz w:val="22"/>
-          <w:szCs w:val="22"/>
-        </w:rPr>
-        <w:t>☐</w:t>
-      </w:r>
-      <w:r>
-        <w:rPr>
-          <w:rFonts w:ascii="Calibri" w:hAnsi="Calibri" w:cs="Calibri"/>
+        <w:shd w:val="clear" w:color="auto" w:fill="FFF1D6"/>
+        <w:rPr>
+          <w:rFonts w:ascii="Segoe UI" w:eastAsia="Times New Roman" w:hAnsi="Segoe UI" w:cs="Segoe UI"/>
+          <w:color w:val="C77700"/>
+        </w:rPr>
+      </w:pPr>
+      <w:r>
+        <w:rPr>
+          <w:rFonts w:ascii="Segoe UI Emoji" w:eastAsia="Times New Roman" w:hAnsi="Segoe UI Emoji" w:cs="Segoe UI Emoji"/>
+          <w:color w:val="C77700"/>
+        </w:rPr>
+        <w:t>📝</w:t>
+      </w:r>
+      <w:r>
+        <w:rPr>
+          <w:rFonts w:ascii="Segoe UI" w:eastAsia="Times New Roman" w:hAnsi="Segoe UI" w:cs="Segoe UI"/>
+          <w:color w:val="C77700"/>
+        </w:rPr>
+        <w:t xml:space="preserve"> 2. Add the changes from Friday's meeting</w:t>
+      </w:r>
+    </w:p>
+    <w:p>
+      <w:pPr>
+        <w:pStyle w:val="t"/>
+        <w:rPr>
+          <w:rFonts w:ascii="Segoe UI" w:hAnsi="Segoe UI" w:cs="Segoe UI"/>
+          <w:color w:val="3D3550"/>
+          <w:sz w:val="22"/>
+          <w:szCs w:val="22"/>
+        </w:rPr>
+      </w:pPr>
+      <w:r>
+        <w:rPr>
+          <w:rFonts w:ascii="Segoe UI Symbol" w:hAnsi="Segoe UI Symbol" w:cs="Segoe UI Symbol"/>
+          <w:color w:val="3D3550"/>
+          <w:sz w:val="22"/>
+          <w:szCs w:val="22"/>
+        </w:rPr>
+        <w:t>☐</w:t>
+      </w:r>
+      <w:r>
+        <w:rPr>
+          <w:rFonts w:ascii="Segoe UI" w:hAnsi="Segoe UI" w:cs="Segoe UI"/>
+          <w:color w:val="3D3550"/>
           <w:sz w:val="22"/>
           <w:szCs w:val="22"/>
         </w:rPr>
@@ -335,22 +438,25 @@
       <w:pPr>
         <w:pStyle w:val="t"/>
         <w:rPr>
-          <w:rFonts w:ascii="Calibri" w:hAnsi="Calibri" w:cs="Calibri"/>
-          <w:sz w:val="22"/>
-          <w:szCs w:val="22"/>
-        </w:rPr>
-      </w:pPr>
-      <w:r>
-        <w:rPr>
-          <w:rFonts w:ascii="Segoe UI Symbol" w:hAnsi="Segoe UI Symbol" w:cs="Segoe UI Symbol"/>
-          <w:sz w:val="22"/>
-          <w:szCs w:val="22"/>
-        </w:rPr>
-        <w:t>☐</w:t>
-      </w:r>
-      <w:r>
-        <w:rPr>
-          <w:rFonts w:ascii="Calibri" w:hAnsi="Calibri" w:cs="Calibri"/>
+          <w:rFonts w:ascii="Segoe UI" w:hAnsi="Segoe UI" w:cs="Segoe UI"/>
+          <w:color w:val="3D3550"/>
+          <w:sz w:val="22"/>
+          <w:szCs w:val="22"/>
+        </w:rPr>
+      </w:pPr>
+      <w:r>
+        <w:rPr>
+          <w:rFonts w:ascii="Segoe UI Symbol" w:hAnsi="Segoe UI Symbol" w:cs="Segoe UI Symbol"/>
+          <w:color w:val="3D3550"/>
+          <w:sz w:val="22"/>
+          <w:szCs w:val="22"/>
+        </w:rPr>
+        <w:t>☐</w:t>
+      </w:r>
+      <w:r>
+        <w:rPr>
+          <w:rFonts w:ascii="Segoe UI" w:hAnsi="Segoe UI" w:cs="Segoe UI"/>
+          <w:color w:val="3D3550"/>
           <w:sz w:val="22"/>
           <w:szCs w:val="22"/>
         </w:rPr>
@@ -361,22 +467,43 @@
       <w:pPr>
         <w:pStyle w:val="t"/>
         <w:rPr>
-          <w:rFonts w:ascii="Calibri" w:hAnsi="Calibri" w:cs="Calibri"/>
-          <w:sz w:val="22"/>
-          <w:szCs w:val="22"/>
-        </w:rPr>
-      </w:pPr>
-      <w:r>
-        <w:rPr>
-          <w:rFonts w:ascii="Segoe UI Symbol" w:hAnsi="Segoe UI Symbol" w:cs="Segoe UI Symbol"/>
-          <w:sz w:val="22"/>
-          <w:szCs w:val="22"/>
-        </w:rPr>
-        <w:t>☐</w:t>
-      </w:r>
-      <w:r>
-        <w:rPr>
-          <w:rFonts w:ascii="Calibri" w:hAnsi="Calibri" w:cs="Calibri"/>
+          <w:rFonts w:ascii="Segoe UI" w:hAnsi="Segoe UI" w:cs="Segoe UI"/>
+          <w:color w:val="3D3550"/>
+          <w:sz w:val="22"/>
+          <w:szCs w:val="22"/>
+        </w:rPr>
+      </w:pPr>
+      <w:r>
+        <w:rPr>
+          <w:rFonts w:ascii="Segoe UI Symbol" w:hAnsi="Segoe UI Symbol" w:cs="Segoe UI Symbol"/>
+          <w:color w:val="3D3550"/>
+          <w:sz w:val="22"/>
+          <w:szCs w:val="22"/>
+        </w:rPr>
+        <w:t>☐</w:t>
+      </w:r>
+      <w:r>
+        <w:rPr>
+          <w:rFonts w:ascii="Segoe UI" w:hAnsi="Segoe UI" w:cs="Segoe UI"/>
+          <w:color w:val="3D3550"/>
+          <w:sz w:val="22"/>
+          <w:szCs w:val="22"/>
+        </w:rPr>
+        <w:t xml:space="preserve"> </w:t>
+      </w:r>
+      <w:r>
+        <w:rPr>
+          <w:rFonts w:ascii="Segoe UI Emoji" w:hAnsi="Segoe UI Emoji" w:cs="Segoe UI Emoji"/>
+          <w:color w:val="3D3550"/>
+          <w:sz w:val="22"/>
+          <w:szCs w:val="22"/>
+        </w:rPr>
+        <w:t>🧪</w:t>
+      </w:r>
+      <w:r>
+        <w:rPr>
+          <w:rFonts w:ascii="Segoe UI" w:hAnsi="Segoe UI" w:cs="Segoe UI"/>
+          <w:color w:val="3D3550"/>
           <w:sz w:val="22"/>
           <w:szCs w:val="22"/>
         </w:rPr>
@@ -386,37 +513,68 @@
     <w:p>
       <w:pPr>
         <w:pStyle w:val="Heading2"/>
-        <w:rPr>
-          <w:rFonts w:ascii="Calibri" w:eastAsia="Times New Roman" w:hAnsi="Calibri" w:cs="Calibri"/>
-        </w:rPr>
-      </w:pPr>
-      <w:r>
-        <w:rPr>
-          <w:rFonts w:ascii="Calibri" w:eastAsia="Times New Roman" w:hAnsi="Calibri" w:cs="Calibri"/>
-        </w:rPr>
-        <w:t>3. Meet with the requirements team</w:t>
-      </w:r>
-    </w:p>
-    <w:p>
-      <w:pPr>
-        <w:pStyle w:val="t"/>
-        <w:rPr>
-          <w:rFonts w:ascii="Calibri" w:hAnsi="Calibri" w:cs="Calibri"/>
-          <w:sz w:val="22"/>
-          <w:szCs w:val="22"/>
-        </w:rPr>
-      </w:pPr>
-      <w:r>
-        <w:rPr>
-          <w:rFonts w:ascii="Segoe UI Symbol" w:hAnsi="Segoe UI Symbol" w:cs="Segoe UI Symbol"/>
-          <w:sz w:val="22"/>
-          <w:szCs w:val="22"/>
-        </w:rPr>
-        <w:t>☐</w:t>
-      </w:r>
-      <w:r>
-        <w:rPr>
-          <w:rFonts w:ascii="Calibri" w:hAnsi="Calibri" w:cs="Calibri"/>
+        <w:shd w:val="clear" w:color="auto" w:fill="E3F4E8"/>
+        <w:rPr>
+          <w:rFonts w:ascii="Segoe UI" w:eastAsia="Times New Roman" w:hAnsi="Segoe UI" w:cs="Segoe UI"/>
+          <w:color w:val="2E7D4F"/>
+        </w:rPr>
+      </w:pPr>
+      <w:r>
+        <w:rPr>
+          <w:rFonts w:ascii="Segoe UI Emoji" w:eastAsia="Times New Roman" w:hAnsi="Segoe UI Emoji" w:cs="Segoe UI Emoji"/>
+          <w:color w:val="2E7D4F"/>
+        </w:rPr>
+        <w:t>🤝</w:t>
+      </w:r>
+      <w:r>
+        <w:rPr>
+          <w:rFonts w:ascii="Segoe UI" w:eastAsia="Times New Roman" w:hAnsi="Segoe UI" w:cs="Segoe UI"/>
+          <w:color w:val="2E7D4F"/>
+        </w:rPr>
+        <w:t xml:space="preserve"> 3. Meet with the requirements team</w:t>
+      </w:r>
+    </w:p>
+    <w:p>
+      <w:pPr>
+        <w:pStyle w:val="t"/>
+        <w:rPr>
+          <w:rFonts w:ascii="Segoe UI" w:hAnsi="Segoe UI" w:cs="Segoe UI"/>
+          <w:color w:val="3D3550"/>
+          <w:sz w:val="22"/>
+          <w:szCs w:val="22"/>
+        </w:rPr>
+      </w:pPr>
+      <w:r>
+        <w:rPr>
+          <w:rFonts w:ascii="Segoe UI Symbol" w:hAnsi="Segoe UI Symbol" w:cs="Segoe UI Symbol"/>
+          <w:color w:val="3D3550"/>
+          <w:sz w:val="22"/>
+          <w:szCs w:val="22"/>
+        </w:rPr>
+        <w:t>☐</w:t>
+      </w:r>
+      <w:r>
+        <w:rPr>
+          <w:rFonts w:ascii="Segoe UI" w:hAnsi="Segoe UI" w:cs="Segoe UI"/>
+          <w:color w:val="3D3550"/>
+          <w:sz w:val="22"/>
+          <w:szCs w:val="22"/>
+        </w:rPr>
+        <w:t xml:space="preserve"> </w:t>
+      </w:r>
+      <w:r>
+        <w:rPr>
+          <w:rFonts w:ascii="Segoe UI Emoji" w:hAnsi="Segoe UI Emoji" w:cs="Segoe UI Emoji"/>
+          <w:color w:val="3D3550"/>
+          <w:sz w:val="22"/>
+          <w:szCs w:val="22"/>
+        </w:rPr>
+        <w:t>📆</w:t>
+      </w:r>
+      <w:r>
+        <w:rPr>
+          <w:rFonts w:ascii="Segoe UI" w:hAnsi="Segoe UI" w:cs="Segoe UI"/>
+          <w:color w:val="3D3550"/>
           <w:sz w:val="22"/>
           <w:szCs w:val="22"/>
         </w:rPr>
@@ -427,22 +585,43 @@
       <w:pPr>
         <w:pStyle w:val="t"/>
         <w:rPr>
-          <w:rFonts w:ascii="Calibri" w:hAnsi="Calibri" w:cs="Calibri"/>
-          <w:sz w:val="22"/>
-          <w:szCs w:val="22"/>
-        </w:rPr>
-      </w:pPr>
-      <w:r>
-        <w:rPr>
-          <w:rFonts w:ascii="Segoe UI Symbol" w:hAnsi="Segoe UI Symbol" w:cs="Segoe UI Symbol"/>
-          <w:sz w:val="22"/>
-          <w:szCs w:val="22"/>
-        </w:rPr>
-        <w:t>☐</w:t>
-      </w:r>
-      <w:r>
-        <w:rPr>
-          <w:rFonts w:ascii="Calibri" w:hAnsi="Calibri" w:cs="Calibri"/>
+          <w:rFonts w:ascii="Segoe UI" w:hAnsi="Segoe UI" w:cs="Segoe UI"/>
+          <w:color w:val="3D3550"/>
+          <w:sz w:val="22"/>
+          <w:szCs w:val="22"/>
+        </w:rPr>
+      </w:pPr>
+      <w:r>
+        <w:rPr>
+          <w:rFonts w:ascii="Segoe UI Symbol" w:hAnsi="Segoe UI Symbol" w:cs="Segoe UI Symbol"/>
+          <w:color w:val="3D3550"/>
+          <w:sz w:val="22"/>
+          <w:szCs w:val="22"/>
+        </w:rPr>
+        <w:t>☐</w:t>
+      </w:r>
+      <w:r>
+        <w:rPr>
+          <w:rFonts w:ascii="Segoe UI" w:hAnsi="Segoe UI" w:cs="Segoe UI"/>
+          <w:color w:val="3D3550"/>
+          <w:sz w:val="22"/>
+          <w:szCs w:val="22"/>
+        </w:rPr>
+        <w:t xml:space="preserve"> </w:t>
+      </w:r>
+      <w:r>
+        <w:rPr>
+          <w:rFonts w:ascii="Segoe UI Emoji" w:hAnsi="Segoe UI Emoji" w:cs="Segoe UI Emoji"/>
+          <w:color w:val="3D3550"/>
+          <w:sz w:val="22"/>
+          <w:szCs w:val="22"/>
+        </w:rPr>
+        <w:t>👀</w:t>
+      </w:r>
+      <w:r>
+        <w:rPr>
+          <w:rFonts w:ascii="Segoe UI" w:hAnsi="Segoe UI" w:cs="Segoe UI"/>
+          <w:color w:val="3D3550"/>
           <w:sz w:val="22"/>
           <w:szCs w:val="22"/>
         </w:rPr>
@@ -453,22 +632,43 @@
       <w:pPr>
         <w:pStyle w:val="t"/>
         <w:rPr>
-          <w:rFonts w:ascii="Calibri" w:hAnsi="Calibri" w:cs="Calibri"/>
-          <w:sz w:val="22"/>
-          <w:szCs w:val="22"/>
-        </w:rPr>
-      </w:pPr>
-      <w:r>
-        <w:rPr>
-          <w:rFonts w:ascii="Segoe UI Symbol" w:hAnsi="Segoe UI Symbol" w:cs="Segoe UI Symbol"/>
-          <w:sz w:val="22"/>
-          <w:szCs w:val="22"/>
-        </w:rPr>
-        <w:t>☐</w:t>
-      </w:r>
-      <w:r>
-        <w:rPr>
-          <w:rFonts w:ascii="Calibri" w:hAnsi="Calibri" w:cs="Calibri"/>
+          <w:rFonts w:ascii="Segoe UI" w:hAnsi="Segoe UI" w:cs="Segoe UI"/>
+          <w:color w:val="3D3550"/>
+          <w:sz w:val="22"/>
+          <w:szCs w:val="22"/>
+        </w:rPr>
+      </w:pPr>
+      <w:r>
+        <w:rPr>
+          <w:rFonts w:ascii="Segoe UI Symbol" w:hAnsi="Segoe UI Symbol" w:cs="Segoe UI Symbol"/>
+          <w:color w:val="3D3550"/>
+          <w:sz w:val="22"/>
+          <w:szCs w:val="22"/>
+        </w:rPr>
+        <w:t>☐</w:t>
+      </w:r>
+      <w:r>
+        <w:rPr>
+          <w:rFonts w:ascii="Segoe UI" w:hAnsi="Segoe UI" w:cs="Segoe UI"/>
+          <w:color w:val="3D3550"/>
+          <w:sz w:val="22"/>
+          <w:szCs w:val="22"/>
+        </w:rPr>
+        <w:t xml:space="preserve"> </w:t>
+      </w:r>
+      <w:r>
+        <w:rPr>
+          <w:rFonts w:ascii="Segoe UI Emoji" w:hAnsi="Segoe UI Emoji" w:cs="Segoe UI Emoji"/>
+          <w:color w:val="3D3550"/>
+          <w:sz w:val="22"/>
+          <w:szCs w:val="22"/>
+        </w:rPr>
+        <w:t>💬</w:t>
+      </w:r>
+      <w:r>
+        <w:rPr>
+          <w:rFonts w:ascii="Segoe UI" w:hAnsi="Segoe UI" w:cs="Segoe UI"/>
+          <w:color w:val="3D3550"/>
           <w:sz w:val="22"/>
           <w:szCs w:val="22"/>
         </w:rPr>
@@ -479,22 +679,25 @@
       <w:pPr>
         <w:pStyle w:val="t"/>
         <w:rPr>
-          <w:rFonts w:ascii="Calibri" w:hAnsi="Calibri" w:cs="Calibri"/>
-          <w:sz w:val="22"/>
-          <w:szCs w:val="22"/>
-        </w:rPr>
-      </w:pPr>
-      <w:r>
-        <w:rPr>
-          <w:rFonts w:ascii="Segoe UI Symbol" w:hAnsi="Segoe UI Symbol" w:cs="Segoe UI Symbol"/>
-          <w:sz w:val="22"/>
-          <w:szCs w:val="22"/>
-        </w:rPr>
-        <w:t>☐</w:t>
-      </w:r>
-      <w:r>
-        <w:rPr>
-          <w:rFonts w:ascii="Calibri" w:hAnsi="Calibri" w:cs="Calibri"/>
+          <w:rFonts w:ascii="Segoe UI" w:hAnsi="Segoe UI" w:cs="Segoe UI"/>
+          <w:color w:val="3D3550"/>
+          <w:sz w:val="22"/>
+          <w:szCs w:val="22"/>
+        </w:rPr>
+      </w:pPr>
+      <w:r>
+        <w:rPr>
+          <w:rFonts w:ascii="Segoe UI Symbol" w:hAnsi="Segoe UI Symbol" w:cs="Segoe UI Symbol"/>
+          <w:color w:val="3D3550"/>
+          <w:sz w:val="22"/>
+          <w:szCs w:val="22"/>
+        </w:rPr>
+        <w:t>☐</w:t>
+      </w:r>
+      <w:r>
+        <w:rPr>
+          <w:rFonts w:ascii="Segoe UI" w:hAnsi="Segoe UI" w:cs="Segoe UI"/>
+          <w:color w:val="3D3550"/>
           <w:sz w:val="22"/>
           <w:szCs w:val="22"/>
         </w:rPr>
@@ -504,20 +707,44 @@
     <w:p>
       <w:pPr>
         <w:pStyle w:val="Heading2"/>
-        <w:rPr>
-          <w:rFonts w:ascii="Calibri" w:eastAsia="Times New Roman" w:hAnsi="Calibri" w:cs="Calibri"/>
-        </w:rPr>
-      </w:pPr>
-      <w:r>
-        <w:rPr>
-          <w:rFonts w:ascii="Calibri" w:eastAsia="Times New Roman" w:hAnsi="Calibri" w:cs="Calibri"/>
-        </w:rPr>
-        <w:t xml:space="preserve">4. Write the technician SOP </w:t>
+        <w:shd w:val="clear" w:color="auto" w:fill="E1EEFB"/>
+        <w:rPr>
+          <w:rFonts w:ascii="Segoe UI" w:eastAsia="Times New Roman" w:hAnsi="Segoe UI" w:cs="Segoe UI"/>
+          <w:color w:val="2563A8"/>
+        </w:rPr>
+      </w:pPr>
+      <w:r>
+        <w:rPr>
+          <w:rFonts w:ascii="Segoe UI Emoji" w:eastAsia="Times New Roman" w:hAnsi="Segoe UI Emoji" w:cs="Segoe UI Emoji"/>
+          <w:color w:val="2563A8"/>
+        </w:rPr>
+        <w:t>🧑</w:t>
+      </w:r>
+      <w:r>
+        <w:rPr>
+          <w:rFonts w:ascii="Segoe UI" w:eastAsia="Times New Roman" w:hAnsi="Segoe UI" w:cs="Segoe UI"/>
+          <w:color w:val="2563A8"/>
+        </w:rPr>
+        <w:t>‍</w:t>
+      </w:r>
+      <w:r>
+        <w:rPr>
+          <w:rFonts w:ascii="Segoe UI Emoji" w:eastAsia="Times New Roman" w:hAnsi="Segoe UI Emoji" w:cs="Segoe UI Emoji"/>
+          <w:color w:val="2563A8"/>
+        </w:rPr>
+        <w:t>🔧</w:t>
+      </w:r>
+      <w:r>
+        <w:rPr>
+          <w:rFonts w:ascii="Segoe UI" w:eastAsia="Times New Roman" w:hAnsi="Segoe UI" w:cs="Segoe UI"/>
+          <w:color w:val="2563A8"/>
+        </w:rPr>
+        <w:t xml:space="preserve"> 4. Write the technician SOP </w:t>
       </w:r>
       <w:r>
         <w:rPr>
           <w:rStyle w:val="sub1"/>
-          <w:rFonts w:ascii="Calibri" w:eastAsia="Times New Roman" w:hAnsi="Calibri" w:cs="Calibri"/>
+          <w:rFonts w:ascii="Segoe UI" w:eastAsia="Times New Roman" w:hAnsi="Segoe UI" w:cs="Segoe UI"/>
           <w:b w:val="0"/>
           <w:bCs w:val="0"/>
         </w:rPr>
@@ -528,22 +755,25 @@
       <w:pPr>
         <w:pStyle w:val="t"/>
         <w:rPr>
-          <w:rFonts w:ascii="Calibri" w:hAnsi="Calibri" w:cs="Calibri"/>
-          <w:sz w:val="22"/>
-          <w:szCs w:val="22"/>
-        </w:rPr>
-      </w:pPr>
-      <w:r>
-        <w:rPr>
-          <w:rFonts w:ascii="Segoe UI Symbol" w:hAnsi="Segoe UI Symbol" w:cs="Segoe UI Symbol"/>
-          <w:sz w:val="22"/>
-          <w:szCs w:val="22"/>
-        </w:rPr>
-        <w:t>☐</w:t>
-      </w:r>
-      <w:r>
-        <w:rPr>
-          <w:rFonts w:ascii="Calibri" w:hAnsi="Calibri" w:cs="Calibri"/>
+          <w:rFonts w:ascii="Segoe UI" w:hAnsi="Segoe UI" w:cs="Segoe UI"/>
+          <w:color w:val="3D3550"/>
+          <w:sz w:val="22"/>
+          <w:szCs w:val="22"/>
+        </w:rPr>
+      </w:pPr>
+      <w:r>
+        <w:rPr>
+          <w:rFonts w:ascii="Segoe UI Symbol" w:hAnsi="Segoe UI Symbol" w:cs="Segoe UI Symbol"/>
+          <w:color w:val="3D3550"/>
+          <w:sz w:val="22"/>
+          <w:szCs w:val="22"/>
+        </w:rPr>
+        <w:t>☐</w:t>
+      </w:r>
+      <w:r>
+        <w:rPr>
+          <w:rFonts w:ascii="Segoe UI" w:hAnsi="Segoe UI" w:cs="Segoe UI"/>
+          <w:color w:val="3D3550"/>
           <w:sz w:val="22"/>
           <w:szCs w:val="22"/>
         </w:rPr>
@@ -554,22 +784,25 @@
       <w:pPr>
         <w:pStyle w:val="t"/>
         <w:rPr>
-          <w:rFonts w:ascii="Calibri" w:hAnsi="Calibri" w:cs="Calibri"/>
-          <w:sz w:val="22"/>
-          <w:szCs w:val="22"/>
-        </w:rPr>
-      </w:pPr>
-      <w:r>
-        <w:rPr>
-          <w:rFonts w:ascii="Segoe UI Symbol" w:hAnsi="Segoe UI Symbol" w:cs="Segoe UI Symbol"/>
-          <w:sz w:val="22"/>
-          <w:szCs w:val="22"/>
-        </w:rPr>
-        <w:t>☐</w:t>
-      </w:r>
-      <w:r>
-        <w:rPr>
-          <w:rFonts w:ascii="Calibri" w:hAnsi="Calibri" w:cs="Calibri"/>
+          <w:rFonts w:ascii="Segoe UI" w:hAnsi="Segoe UI" w:cs="Segoe UI"/>
+          <w:color w:val="3D3550"/>
+          <w:sz w:val="22"/>
+          <w:szCs w:val="22"/>
+        </w:rPr>
+      </w:pPr>
+      <w:r>
+        <w:rPr>
+          <w:rFonts w:ascii="Segoe UI Symbol" w:hAnsi="Segoe UI Symbol" w:cs="Segoe UI Symbol"/>
+          <w:color w:val="3D3550"/>
+          <w:sz w:val="22"/>
+          <w:szCs w:val="22"/>
+        </w:rPr>
+        <w:t>☐</w:t>
+      </w:r>
+      <w:r>
+        <w:rPr>
+          <w:rFonts w:ascii="Segoe UI" w:hAnsi="Segoe UI" w:cs="Segoe UI"/>
+          <w:color w:val="3D3550"/>
           <w:sz w:val="22"/>
           <w:szCs w:val="22"/>
         </w:rPr>
@@ -580,48 +813,108 @@
       <w:pPr>
         <w:pStyle w:val="t"/>
         <w:rPr>
-          <w:rFonts w:ascii="Calibri" w:hAnsi="Calibri" w:cs="Calibri"/>
-          <w:sz w:val="22"/>
-          <w:szCs w:val="22"/>
-        </w:rPr>
-      </w:pPr>
-      <w:r>
-        <w:rPr>
-          <w:rFonts w:ascii="Segoe UI Symbol" w:hAnsi="Segoe UI Symbol" w:cs="Segoe UI Symbol"/>
-          <w:sz w:val="22"/>
-          <w:szCs w:val="22"/>
-        </w:rPr>
-        <w:t>☐</w:t>
-      </w:r>
-      <w:r>
-        <w:rPr>
-          <w:rFonts w:ascii="Calibri" w:hAnsi="Calibri" w:cs="Calibri"/>
-          <w:sz w:val="22"/>
-          <w:szCs w:val="22"/>
-        </w:rPr>
-        <w:t xml:space="preserve"> Approve and Reject, and what happens to the notes</w:t>
-      </w:r>
-    </w:p>
-    <w:p>
-      <w:pPr>
-        <w:pStyle w:val="t"/>
-        <w:rPr>
-          <w:rFonts w:ascii="Calibri" w:hAnsi="Calibri" w:cs="Calibri"/>
-          <w:sz w:val="22"/>
-          <w:szCs w:val="22"/>
-        </w:rPr>
-      </w:pPr>
-      <w:r>
-        <w:rPr>
-          <w:rFonts w:ascii="Segoe UI Symbol" w:hAnsi="Segoe UI Symbol" w:cs="Segoe UI Symbol"/>
-          <w:sz w:val="22"/>
-          <w:szCs w:val="22"/>
-        </w:rPr>
-        <w:t>☐</w:t>
-      </w:r>
-      <w:r>
-        <w:rPr>
-          <w:rFonts w:ascii="Calibri" w:hAnsi="Calibri" w:cs="Calibri"/>
+          <w:rFonts w:ascii="Segoe UI" w:hAnsi="Segoe UI" w:cs="Segoe UI"/>
+          <w:color w:val="3D3550"/>
+          <w:sz w:val="22"/>
+          <w:szCs w:val="22"/>
+        </w:rPr>
+      </w:pPr>
+      <w:r>
+        <w:rPr>
+          <w:rFonts w:ascii="Segoe UI Symbol" w:hAnsi="Segoe UI Symbol" w:cs="Segoe UI Symbol"/>
+          <w:color w:val="3D3550"/>
+          <w:sz w:val="22"/>
+          <w:szCs w:val="22"/>
+        </w:rPr>
+        <w:t>☐</w:t>
+      </w:r>
+      <w:r>
+        <w:rPr>
+          <w:rFonts w:ascii="Segoe UI" w:hAnsi="Segoe UI" w:cs="Segoe UI"/>
+          <w:color w:val="3D3550"/>
+          <w:sz w:val="22"/>
+          <w:szCs w:val="22"/>
+        </w:rPr>
+        <w:t xml:space="preserve"> </w:t>
+      </w:r>
+      <w:r>
+        <w:rPr>
+          <w:rFonts w:ascii="Segoe UI Emoji" w:hAnsi="Segoe UI Emoji" w:cs="Segoe UI Emoji"/>
+          <w:color w:val="3D3550"/>
+          <w:sz w:val="22"/>
+          <w:szCs w:val="22"/>
+        </w:rPr>
+        <w:t>✅</w:t>
+      </w:r>
+      <w:r>
+        <w:rPr>
+          <w:rFonts w:ascii="Segoe UI" w:hAnsi="Segoe UI" w:cs="Segoe UI"/>
+          <w:color w:val="3D3550"/>
+          <w:sz w:val="22"/>
+          <w:szCs w:val="22"/>
+        </w:rPr>
+        <w:t xml:space="preserve"> Approve and </w:t>
+      </w:r>
+      <w:r>
+        <w:rPr>
+          <w:rFonts w:ascii="Segoe UI Emoji" w:hAnsi="Segoe UI Emoji" w:cs="Segoe UI Emoji"/>
+          <w:color w:val="3D3550"/>
+          <w:sz w:val="22"/>
+          <w:szCs w:val="22"/>
+        </w:rPr>
+        <w:t>❌</w:t>
+      </w:r>
+      <w:r>
+        <w:rPr>
+          <w:rFonts w:ascii="Segoe UI" w:hAnsi="Segoe UI" w:cs="Segoe UI"/>
+          <w:color w:val="3D3550"/>
+          <w:sz w:val="22"/>
+          <w:szCs w:val="22"/>
+        </w:rPr>
+        <w:t xml:space="preserve"> Reject, and what happens to the notes</w:t>
+      </w:r>
+    </w:p>
+    <w:p>
+      <w:pPr>
+        <w:pStyle w:val="t"/>
+        <w:rPr>
+          <w:rFonts w:ascii="Segoe UI" w:hAnsi="Segoe UI" w:cs="Segoe UI"/>
+          <w:color w:val="3D3550"/>
+          <w:sz w:val="22"/>
+          <w:szCs w:val="22"/>
+        </w:rPr>
+      </w:pPr>
+      <w:r>
+        <w:rPr>
+          <w:rFonts w:ascii="Segoe UI Symbol" w:hAnsi="Segoe UI Symbol" w:cs="Segoe UI Symbol"/>
+          <w:color w:val="3D3550"/>
+          <w:sz w:val="22"/>
+          <w:szCs w:val="22"/>
+        </w:rPr>
+        <w:t>☐</w:t>
+      </w:r>
+      <w:r>
+        <w:rPr>
+          <w:rFonts w:ascii="Segoe UI" w:hAnsi="Segoe UI" w:cs="Segoe UI"/>
+          <w:color w:val="3D3550"/>
+          <w:sz w:val="22"/>
+          <w:szCs w:val="22"/>
+        </w:rPr>
+        <w:t xml:space="preserve"> </w:t>
+      </w:r>
+      <w:r>
+        <w:rPr>
+          <w:rFonts w:ascii="Segoe UI Emoji" w:hAnsi="Segoe UI Emoji" w:cs="Segoe UI Emoji"/>
+          <w:color w:val="3D3550"/>
+          <w:sz w:val="22"/>
+          <w:szCs w:val="22"/>
+        </w:rPr>
+        <w:t>⏪</w:t>
+      </w:r>
+      <w:r>
+        <w:rPr>
+          <w:rFonts w:ascii="Segoe UI" w:hAnsi="Segoe UI" w:cs="Segoe UI"/>
+          <w:color w:val="3D3550"/>
           <w:sz w:val="22"/>
           <w:szCs w:val="22"/>
         </w:rPr>
@@ -632,22 +925,43 @@
       <w:pPr>
         <w:pStyle w:val="t"/>
         <w:rPr>
-          <w:rFonts w:ascii="Calibri" w:hAnsi="Calibri" w:cs="Calibri"/>
-          <w:sz w:val="22"/>
-          <w:szCs w:val="22"/>
-        </w:rPr>
-      </w:pPr>
-      <w:r>
-        <w:rPr>
-          <w:rFonts w:ascii="Segoe UI Symbol" w:hAnsi="Segoe UI Symbol" w:cs="Segoe UI Symbol"/>
-          <w:sz w:val="22"/>
-          <w:szCs w:val="22"/>
-        </w:rPr>
-        <w:t>☐</w:t>
-      </w:r>
-      <w:r>
-        <w:rPr>
-          <w:rFonts w:ascii="Calibri" w:hAnsi="Calibri" w:cs="Calibri"/>
+          <w:rFonts w:ascii="Segoe UI" w:hAnsi="Segoe UI" w:cs="Segoe UI"/>
+          <w:color w:val="3D3550"/>
+          <w:sz w:val="22"/>
+          <w:szCs w:val="22"/>
+        </w:rPr>
+      </w:pPr>
+      <w:r>
+        <w:rPr>
+          <w:rFonts w:ascii="Segoe UI Symbol" w:hAnsi="Segoe UI Symbol" w:cs="Segoe UI Symbol"/>
+          <w:color w:val="3D3550"/>
+          <w:sz w:val="22"/>
+          <w:szCs w:val="22"/>
+        </w:rPr>
+        <w:t>☐</w:t>
+      </w:r>
+      <w:r>
+        <w:rPr>
+          <w:rFonts w:ascii="Segoe UI" w:hAnsi="Segoe UI" w:cs="Segoe UI"/>
+          <w:color w:val="3D3550"/>
+          <w:sz w:val="22"/>
+          <w:szCs w:val="22"/>
+        </w:rPr>
+        <w:t xml:space="preserve"> </w:t>
+      </w:r>
+      <w:r>
+        <w:rPr>
+          <w:rFonts w:ascii="Segoe UI Emoji" w:hAnsi="Segoe UI Emoji" w:cs="Segoe UI Emoji"/>
+          <w:color w:val="3D3550"/>
+          <w:sz w:val="22"/>
+          <w:szCs w:val="22"/>
+        </w:rPr>
+        <w:t>📸</w:t>
+      </w:r>
+      <w:r>
+        <w:rPr>
+          <w:rFonts w:ascii="Segoe UI" w:hAnsi="Segoe UI" w:cs="Segoe UI"/>
+          <w:color w:val="3D3550"/>
           <w:sz w:val="22"/>
           <w:szCs w:val="22"/>
         </w:rPr>
@@ -657,20 +971,30 @@
     <w:p>
       <w:pPr>
         <w:pStyle w:val="Heading2"/>
-        <w:rPr>
-          <w:rFonts w:ascii="Calibri" w:eastAsia="Times New Roman" w:hAnsi="Calibri" w:cs="Calibri"/>
-        </w:rPr>
-      </w:pPr>
-      <w:r>
-        <w:rPr>
-          <w:rFonts w:ascii="Calibri" w:eastAsia="Times New Roman" w:hAnsi="Calibri" w:cs="Calibri"/>
-        </w:rPr>
-        <w:t xml:space="preserve">5. Write the user SOP </w:t>
+        <w:shd w:val="clear" w:color="auto" w:fill="EDE4FA"/>
+        <w:rPr>
+          <w:rFonts w:ascii="Segoe UI" w:eastAsia="Times New Roman" w:hAnsi="Segoe UI" w:cs="Segoe UI"/>
+          <w:color w:val="6A3FB0"/>
+        </w:rPr>
+      </w:pPr>
+      <w:r>
+        <w:rPr>
+          <w:rFonts w:ascii="Segoe UI Emoji" w:eastAsia="Times New Roman" w:hAnsi="Segoe UI Emoji" w:cs="Segoe UI Emoji"/>
+          <w:color w:val="6A3FB0"/>
+        </w:rPr>
+        <w:t>🙋</w:t>
+      </w:r>
+      <w:r>
+        <w:rPr>
+          <w:rFonts w:ascii="Segoe UI" w:eastAsia="Times New Roman" w:hAnsi="Segoe UI" w:cs="Segoe UI"/>
+          <w:color w:val="6A3FB0"/>
+        </w:rPr>
+        <w:t xml:space="preserve"> 5. Write the user SOP </w:t>
       </w:r>
       <w:r>
         <w:rPr>
           <w:rStyle w:val="sub1"/>
-          <w:rFonts w:ascii="Calibri" w:eastAsia="Times New Roman" w:hAnsi="Calibri" w:cs="Calibri"/>
+          <w:rFonts w:ascii="Segoe UI" w:eastAsia="Times New Roman" w:hAnsi="Segoe UI" w:cs="Segoe UI"/>
           <w:b w:val="0"/>
           <w:bCs w:val="0"/>
         </w:rPr>
@@ -681,22 +1005,25 @@
       <w:pPr>
         <w:pStyle w:val="t"/>
         <w:rPr>
-          <w:rFonts w:ascii="Calibri" w:hAnsi="Calibri" w:cs="Calibri"/>
-          <w:sz w:val="22"/>
-          <w:szCs w:val="22"/>
-        </w:rPr>
-      </w:pPr>
-      <w:r>
-        <w:rPr>
-          <w:rFonts w:ascii="Segoe UI Symbol" w:hAnsi="Segoe UI Symbol" w:cs="Segoe UI Symbol"/>
-          <w:sz w:val="22"/>
-          <w:szCs w:val="22"/>
-        </w:rPr>
-        <w:t>☐</w:t>
-      </w:r>
-      <w:r>
-        <w:rPr>
-          <w:rFonts w:ascii="Calibri" w:hAnsi="Calibri" w:cs="Calibri"/>
+          <w:rFonts w:ascii="Segoe UI" w:hAnsi="Segoe UI" w:cs="Segoe UI"/>
+          <w:color w:val="3D3550"/>
+          <w:sz w:val="22"/>
+          <w:szCs w:val="22"/>
+        </w:rPr>
+      </w:pPr>
+      <w:r>
+        <w:rPr>
+          <w:rFonts w:ascii="Segoe UI Symbol" w:hAnsi="Segoe UI Symbol" w:cs="Segoe UI Symbol"/>
+          <w:color w:val="3D3550"/>
+          <w:sz w:val="22"/>
+          <w:szCs w:val="22"/>
+        </w:rPr>
+        <w:t>☐</w:t>
+      </w:r>
+      <w:r>
+        <w:rPr>
+          <w:rFonts w:ascii="Segoe UI" w:hAnsi="Segoe UI" w:cs="Segoe UI"/>
+          <w:color w:val="3D3550"/>
           <w:sz w:val="22"/>
           <w:szCs w:val="22"/>
         </w:rPr>
@@ -707,22 +1034,44 @@
       <w:pPr>
         <w:pStyle w:val="t"/>
         <w:rPr>
-          <w:rFonts w:ascii="Calibri" w:hAnsi="Calibri" w:cs="Calibri"/>
-          <w:sz w:val="22"/>
-          <w:szCs w:val="22"/>
-        </w:rPr>
-      </w:pPr>
-      <w:r>
-        <w:rPr>
-          <w:rFonts w:ascii="Segoe UI Symbol" w:hAnsi="Segoe UI Symbol" w:cs="Segoe UI Symbol"/>
-          <w:sz w:val="22"/>
-          <w:szCs w:val="22"/>
-        </w:rPr>
-        <w:t>☐</w:t>
-      </w:r>
-      <w:r>
-        <w:rPr>
-          <w:rFonts w:ascii="Calibri" w:hAnsi="Calibri" w:cs="Calibri"/>
+          <w:rFonts w:ascii="Segoe UI" w:hAnsi="Segoe UI" w:cs="Segoe UI"/>
+          <w:color w:val="3D3550"/>
+          <w:sz w:val="22"/>
+          <w:szCs w:val="22"/>
+        </w:rPr>
+      </w:pPr>
+      <w:r>
+        <w:rPr>
+          <w:rFonts w:ascii="Segoe UI Symbol" w:hAnsi="Segoe UI Symbol" w:cs="Segoe UI Symbol"/>
+          <w:color w:val="3D3550"/>
+          <w:sz w:val="22"/>
+          <w:szCs w:val="22"/>
+        </w:rPr>
+        <w:lastRenderedPageBreak/>
+        <w:t>☐</w:t>
+      </w:r>
+      <w:r>
+        <w:rPr>
+          <w:rFonts w:ascii="Segoe UI" w:hAnsi="Segoe UI" w:cs="Segoe UI"/>
+          <w:color w:val="3D3550"/>
+          <w:sz w:val="22"/>
+          <w:szCs w:val="22"/>
+        </w:rPr>
+        <w:t xml:space="preserve"> </w:t>
+      </w:r>
+      <w:r>
+        <w:rPr>
+          <w:rFonts w:ascii="Segoe UI Emoji" w:hAnsi="Segoe UI Emoji" w:cs="Segoe UI Emoji"/>
+          <w:color w:val="3D3550"/>
+          <w:sz w:val="22"/>
+          <w:szCs w:val="22"/>
+        </w:rPr>
+        <w:t>📎</w:t>
+      </w:r>
+      <w:r>
+        <w:rPr>
+          <w:rFonts w:ascii="Segoe UI" w:hAnsi="Segoe UI" w:cs="Segoe UI"/>
+          <w:color w:val="3D3550"/>
           <w:sz w:val="22"/>
           <w:szCs w:val="22"/>
         </w:rPr>
@@ -733,22 +1082,43 @@
       <w:pPr>
         <w:pStyle w:val="t"/>
         <w:rPr>
-          <w:rFonts w:ascii="Calibri" w:hAnsi="Calibri" w:cs="Calibri"/>
-          <w:sz w:val="22"/>
-          <w:szCs w:val="22"/>
-        </w:rPr>
-      </w:pPr>
-      <w:r>
-        <w:rPr>
-          <w:rFonts w:ascii="Segoe UI Symbol" w:hAnsi="Segoe UI Symbol" w:cs="Segoe UI Symbol"/>
-          <w:sz w:val="22"/>
-          <w:szCs w:val="22"/>
-        </w:rPr>
-        <w:t>☐</w:t>
-      </w:r>
-      <w:r>
-        <w:rPr>
-          <w:rFonts w:ascii="Calibri" w:hAnsi="Calibri" w:cs="Calibri"/>
+          <w:rFonts w:ascii="Segoe UI" w:hAnsi="Segoe UI" w:cs="Segoe UI"/>
+          <w:color w:val="3D3550"/>
+          <w:sz w:val="22"/>
+          <w:szCs w:val="22"/>
+        </w:rPr>
+      </w:pPr>
+      <w:r>
+        <w:rPr>
+          <w:rFonts w:ascii="Segoe UI Symbol" w:hAnsi="Segoe UI Symbol" w:cs="Segoe UI Symbol"/>
+          <w:color w:val="3D3550"/>
+          <w:sz w:val="22"/>
+          <w:szCs w:val="22"/>
+        </w:rPr>
+        <w:t>☐</w:t>
+      </w:r>
+      <w:r>
+        <w:rPr>
+          <w:rFonts w:ascii="Segoe UI" w:hAnsi="Segoe UI" w:cs="Segoe UI"/>
+          <w:color w:val="3D3550"/>
+          <w:sz w:val="22"/>
+          <w:szCs w:val="22"/>
+        </w:rPr>
+        <w:t xml:space="preserve"> </w:t>
+      </w:r>
+      <w:r>
+        <w:rPr>
+          <w:rFonts w:ascii="Segoe UI Emoji" w:hAnsi="Segoe UI Emoji" w:cs="Segoe UI Emoji"/>
+          <w:color w:val="3D3550"/>
+          <w:sz w:val="22"/>
+          <w:szCs w:val="22"/>
+        </w:rPr>
+        <w:t>🔍</w:t>
+      </w:r>
+      <w:r>
+        <w:rPr>
+          <w:rFonts w:ascii="Segoe UI" w:hAnsi="Segoe UI" w:cs="Segoe UI"/>
+          <w:color w:val="3D3550"/>
           <w:sz w:val="22"/>
           <w:szCs w:val="22"/>
         </w:rPr>
@@ -758,38 +1128,68 @@
     <w:p>
       <w:pPr>
         <w:pStyle w:val="Heading2"/>
-        <w:rPr>
-          <w:rFonts w:ascii="Calibri" w:eastAsia="Times New Roman" w:hAnsi="Calibri" w:cs="Calibri"/>
-        </w:rPr>
-      </w:pPr>
-      <w:r>
-        <w:rPr>
-          <w:rFonts w:ascii="Calibri" w:eastAsia="Times New Roman" w:hAnsi="Calibri" w:cs="Calibri"/>
-        </w:rPr>
-        <w:lastRenderedPageBreak/>
-        <w:t>6. Start migrating the app to the Config Management SharePoint site</w:t>
-      </w:r>
-    </w:p>
-    <w:p>
-      <w:pPr>
-        <w:pStyle w:val="t"/>
-        <w:rPr>
-          <w:rFonts w:ascii="Calibri" w:hAnsi="Calibri" w:cs="Calibri"/>
-          <w:sz w:val="22"/>
-          <w:szCs w:val="22"/>
-        </w:rPr>
-      </w:pPr>
-      <w:r>
-        <w:rPr>
-          <w:rFonts w:ascii="Segoe UI Symbol" w:hAnsi="Segoe UI Symbol" w:cs="Segoe UI Symbol"/>
-          <w:sz w:val="22"/>
-          <w:szCs w:val="22"/>
-        </w:rPr>
-        <w:t>☐</w:t>
-      </w:r>
-      <w:r>
-        <w:rPr>
-          <w:rFonts w:ascii="Calibri" w:hAnsi="Calibri" w:cs="Calibri"/>
+        <w:shd w:val="clear" w:color="auto" w:fill="DFF5F5"/>
+        <w:rPr>
+          <w:rFonts w:ascii="Segoe UI" w:eastAsia="Times New Roman" w:hAnsi="Segoe UI" w:cs="Segoe UI"/>
+          <w:color w:val="157A7A"/>
+        </w:rPr>
+      </w:pPr>
+      <w:r>
+        <w:rPr>
+          <w:rFonts w:ascii="Segoe UI Emoji" w:eastAsia="Times New Roman" w:hAnsi="Segoe UI Emoji" w:cs="Segoe UI Emoji"/>
+          <w:color w:val="157A7A"/>
+        </w:rPr>
+        <w:t>🚚</w:t>
+      </w:r>
+      <w:r>
+        <w:rPr>
+          <w:rFonts w:ascii="Segoe UI" w:eastAsia="Times New Roman" w:hAnsi="Segoe UI" w:cs="Segoe UI"/>
+          <w:color w:val="157A7A"/>
+        </w:rPr>
+        <w:t xml:space="preserve"> 6. Start migrating the app to the Config Management SharePoint site</w:t>
+      </w:r>
+    </w:p>
+    <w:p>
+      <w:pPr>
+        <w:pStyle w:val="t"/>
+        <w:rPr>
+          <w:rFonts w:ascii="Segoe UI" w:hAnsi="Segoe UI" w:cs="Segoe UI"/>
+          <w:color w:val="3D3550"/>
+          <w:sz w:val="22"/>
+          <w:szCs w:val="22"/>
+        </w:rPr>
+      </w:pPr>
+      <w:r>
+        <w:rPr>
+          <w:rFonts w:ascii="Segoe UI Symbol" w:hAnsi="Segoe UI Symbol" w:cs="Segoe UI Symbol"/>
+          <w:color w:val="3D3550"/>
+          <w:sz w:val="22"/>
+          <w:szCs w:val="22"/>
+        </w:rPr>
+        <w:t>☐</w:t>
+      </w:r>
+      <w:r>
+        <w:rPr>
+          <w:rFonts w:ascii="Segoe UI" w:hAnsi="Segoe UI" w:cs="Segoe UI"/>
+          <w:color w:val="3D3550"/>
+          <w:sz w:val="22"/>
+          <w:szCs w:val="22"/>
+        </w:rPr>
+        <w:t xml:space="preserve"> </w:t>
+      </w:r>
+      <w:r>
+        <w:rPr>
+          <w:rFonts w:ascii="Segoe UI Emoji" w:hAnsi="Segoe UI Emoji" w:cs="Segoe UI Emoji"/>
+          <w:color w:val="3D3550"/>
+          <w:sz w:val="22"/>
+          <w:szCs w:val="22"/>
+        </w:rPr>
+        <w:t>📋</w:t>
+      </w:r>
+      <w:r>
+        <w:rPr>
+          <w:rFonts w:ascii="Segoe UI" w:hAnsi="Segoe UI" w:cs="Segoe UI"/>
+          <w:color w:val="3D3550"/>
           <w:sz w:val="22"/>
           <w:szCs w:val="22"/>
         </w:rPr>
@@ -800,22 +1200,25 @@
       <w:pPr>
         <w:pStyle w:val="t"/>
         <w:rPr>
-          <w:rFonts w:ascii="Calibri" w:hAnsi="Calibri" w:cs="Calibri"/>
-          <w:sz w:val="22"/>
-          <w:szCs w:val="22"/>
-        </w:rPr>
-      </w:pPr>
-      <w:r>
-        <w:rPr>
-          <w:rFonts w:ascii="Segoe UI Symbol" w:hAnsi="Segoe UI Symbol" w:cs="Segoe UI Symbol"/>
-          <w:sz w:val="22"/>
-          <w:szCs w:val="22"/>
-        </w:rPr>
-        <w:t>☐</w:t>
-      </w:r>
-      <w:r>
-        <w:rPr>
-          <w:rFonts w:ascii="Calibri" w:hAnsi="Calibri" w:cs="Calibri"/>
+          <w:rFonts w:ascii="Segoe UI" w:hAnsi="Segoe UI" w:cs="Segoe UI"/>
+          <w:color w:val="3D3550"/>
+          <w:sz w:val="22"/>
+          <w:szCs w:val="22"/>
+        </w:rPr>
+      </w:pPr>
+      <w:r>
+        <w:rPr>
+          <w:rFonts w:ascii="Segoe UI Symbol" w:hAnsi="Segoe UI Symbol" w:cs="Segoe UI Symbol"/>
+          <w:color w:val="3D3550"/>
+          <w:sz w:val="22"/>
+          <w:szCs w:val="22"/>
+        </w:rPr>
+        <w:t>☐</w:t>
+      </w:r>
+      <w:r>
+        <w:rPr>
+          <w:rFonts w:ascii="Segoe UI" w:hAnsi="Segoe UI" w:cs="Segoe UI"/>
+          <w:color w:val="3D3550"/>
           <w:sz w:val="22"/>
           <w:szCs w:val="22"/>
         </w:rPr>
@@ -826,22 +1229,43 @@
       <w:pPr>
         <w:pStyle w:val="t"/>
         <w:rPr>
-          <w:rFonts w:ascii="Calibri" w:hAnsi="Calibri" w:cs="Calibri"/>
-          <w:sz w:val="22"/>
-          <w:szCs w:val="22"/>
-        </w:rPr>
-      </w:pPr>
-      <w:r>
-        <w:rPr>
-          <w:rFonts w:ascii="Segoe UI Symbol" w:hAnsi="Segoe UI Symbol" w:cs="Segoe UI Symbol"/>
-          <w:sz w:val="22"/>
-          <w:szCs w:val="22"/>
-        </w:rPr>
-        <w:t>☐</w:t>
-      </w:r>
-      <w:r>
-        <w:rPr>
-          <w:rFonts w:ascii="Calibri" w:hAnsi="Calibri" w:cs="Calibri"/>
+          <w:rFonts w:ascii="Segoe UI" w:hAnsi="Segoe UI" w:cs="Segoe UI"/>
+          <w:color w:val="3D3550"/>
+          <w:sz w:val="22"/>
+          <w:szCs w:val="22"/>
+        </w:rPr>
+      </w:pPr>
+      <w:r>
+        <w:rPr>
+          <w:rFonts w:ascii="Segoe UI Symbol" w:hAnsi="Segoe UI Symbol" w:cs="Segoe UI Symbol"/>
+          <w:color w:val="3D3550"/>
+          <w:sz w:val="22"/>
+          <w:szCs w:val="22"/>
+        </w:rPr>
+        <w:t>☐</w:t>
+      </w:r>
+      <w:r>
+        <w:rPr>
+          <w:rFonts w:ascii="Segoe UI" w:hAnsi="Segoe UI" w:cs="Segoe UI"/>
+          <w:color w:val="3D3550"/>
+          <w:sz w:val="22"/>
+          <w:szCs w:val="22"/>
+        </w:rPr>
+        <w:t xml:space="preserve"> </w:t>
+      </w:r>
+      <w:r>
+        <w:rPr>
+          <w:rFonts w:ascii="Segoe UI Emoji" w:hAnsi="Segoe UI Emoji" w:cs="Segoe UI Emoji"/>
+          <w:color w:val="3D3550"/>
+          <w:sz w:val="22"/>
+          <w:szCs w:val="22"/>
+        </w:rPr>
+        <w:t>🔌</w:t>
+      </w:r>
+      <w:r>
+        <w:rPr>
+          <w:rFonts w:ascii="Segoe UI" w:hAnsi="Segoe UI" w:cs="Segoe UI"/>
+          <w:color w:val="3D3550"/>
           <w:sz w:val="22"/>
           <w:szCs w:val="22"/>
         </w:rPr>
@@ -852,22 +1276,25 @@
       <w:pPr>
         <w:pStyle w:val="t"/>
         <w:rPr>
-          <w:rFonts w:ascii="Calibri" w:hAnsi="Calibri" w:cs="Calibri"/>
-          <w:sz w:val="22"/>
-          <w:szCs w:val="22"/>
-        </w:rPr>
-      </w:pPr>
-      <w:r>
-        <w:rPr>
-          <w:rFonts w:ascii="Segoe UI Symbol" w:hAnsi="Segoe UI Symbol" w:cs="Segoe UI Symbol"/>
-          <w:sz w:val="22"/>
-          <w:szCs w:val="22"/>
-        </w:rPr>
-        <w:t>☐</w:t>
-      </w:r>
-      <w:r>
-        <w:rPr>
-          <w:rFonts w:ascii="Calibri" w:hAnsi="Calibri" w:cs="Calibri"/>
+          <w:rFonts w:ascii="Segoe UI" w:hAnsi="Segoe UI" w:cs="Segoe UI"/>
+          <w:color w:val="3D3550"/>
+          <w:sz w:val="22"/>
+          <w:szCs w:val="22"/>
+        </w:rPr>
+      </w:pPr>
+      <w:r>
+        <w:rPr>
+          <w:rFonts w:ascii="Segoe UI Symbol" w:hAnsi="Segoe UI Symbol" w:cs="Segoe UI Symbol"/>
+          <w:color w:val="3D3550"/>
+          <w:sz w:val="22"/>
+          <w:szCs w:val="22"/>
+        </w:rPr>
+        <w:t>☐</w:t>
+      </w:r>
+      <w:r>
+        <w:rPr>
+          <w:rFonts w:ascii="Segoe UI" w:hAnsi="Segoe UI" w:cs="Segoe UI"/>
+          <w:color w:val="3D3550"/>
           <w:sz w:val="22"/>
           <w:szCs w:val="22"/>
         </w:rPr>
@@ -877,37 +1304,68 @@
     <w:p>
       <w:pPr>
         <w:pStyle w:val="Heading2"/>
-        <w:rPr>
-          <w:rFonts w:ascii="Calibri" w:eastAsia="Times New Roman" w:hAnsi="Calibri" w:cs="Calibri"/>
-        </w:rPr>
-      </w:pPr>
-      <w:r>
-        <w:rPr>
-          <w:rFonts w:ascii="Calibri" w:eastAsia="Times New Roman" w:hAnsi="Calibri" w:cs="Calibri"/>
-        </w:rPr>
-        <w:t>7. Begin the Config Management SharePoint redesign</w:t>
-      </w:r>
-    </w:p>
-    <w:p>
-      <w:pPr>
-        <w:pStyle w:val="t"/>
-        <w:rPr>
-          <w:rFonts w:ascii="Calibri" w:hAnsi="Calibri" w:cs="Calibri"/>
-          <w:sz w:val="22"/>
-          <w:szCs w:val="22"/>
-        </w:rPr>
-      </w:pPr>
-      <w:r>
-        <w:rPr>
-          <w:rFonts w:ascii="Segoe UI Symbol" w:hAnsi="Segoe UI Symbol" w:cs="Segoe UI Symbol"/>
-          <w:sz w:val="22"/>
-          <w:szCs w:val="22"/>
-        </w:rPr>
-        <w:t>☐</w:t>
-      </w:r>
-      <w:r>
-        <w:rPr>
-          <w:rFonts w:ascii="Calibri" w:hAnsi="Calibri" w:cs="Calibri"/>
+        <w:shd w:val="clear" w:color="auto" w:fill="FCE8DD"/>
+        <w:rPr>
+          <w:rFonts w:ascii="Segoe UI" w:eastAsia="Times New Roman" w:hAnsi="Segoe UI" w:cs="Segoe UI"/>
+          <w:color w:val="B4532A"/>
+        </w:rPr>
+      </w:pPr>
+      <w:r>
+        <w:rPr>
+          <w:rFonts w:ascii="Segoe UI Emoji" w:eastAsia="Times New Roman" w:hAnsi="Segoe UI Emoji" w:cs="Segoe UI Emoji"/>
+          <w:color w:val="B4532A"/>
+        </w:rPr>
+        <w:t>🎨</w:t>
+      </w:r>
+      <w:r>
+        <w:rPr>
+          <w:rFonts w:ascii="Segoe UI" w:eastAsia="Times New Roman" w:hAnsi="Segoe UI" w:cs="Segoe UI"/>
+          <w:color w:val="B4532A"/>
+        </w:rPr>
+        <w:t xml:space="preserve"> 7. Begin the Config Management SharePoint redesign</w:t>
+      </w:r>
+    </w:p>
+    <w:p>
+      <w:pPr>
+        <w:pStyle w:val="t"/>
+        <w:rPr>
+          <w:rFonts w:ascii="Segoe UI" w:hAnsi="Segoe UI" w:cs="Segoe UI"/>
+          <w:color w:val="3D3550"/>
+          <w:sz w:val="22"/>
+          <w:szCs w:val="22"/>
+        </w:rPr>
+      </w:pPr>
+      <w:r>
+        <w:rPr>
+          <w:rFonts w:ascii="Segoe UI Symbol" w:hAnsi="Segoe UI Symbol" w:cs="Segoe UI Symbol"/>
+          <w:color w:val="3D3550"/>
+          <w:sz w:val="22"/>
+          <w:szCs w:val="22"/>
+        </w:rPr>
+        <w:t>☐</w:t>
+      </w:r>
+      <w:r>
+        <w:rPr>
+          <w:rFonts w:ascii="Segoe UI" w:hAnsi="Segoe UI" w:cs="Segoe UI"/>
+          <w:color w:val="3D3550"/>
+          <w:sz w:val="22"/>
+          <w:szCs w:val="22"/>
+        </w:rPr>
+        <w:t xml:space="preserve"> </w:t>
+      </w:r>
+      <w:r>
+        <w:rPr>
+          <w:rFonts w:ascii="Segoe UI Emoji" w:hAnsi="Segoe UI Emoji" w:cs="Segoe UI Emoji"/>
+          <w:color w:val="3D3550"/>
+          <w:sz w:val="22"/>
+          <w:szCs w:val="22"/>
+        </w:rPr>
+        <w:t>🧭</w:t>
+      </w:r>
+      <w:r>
+        <w:rPr>
+          <w:rFonts w:ascii="Segoe UI" w:hAnsi="Segoe UI" w:cs="Segoe UI"/>
+          <w:color w:val="3D3550"/>
           <w:sz w:val="22"/>
           <w:szCs w:val="22"/>
         </w:rPr>
@@ -918,22 +1376,52 @@
       <w:pPr>
         <w:pStyle w:val="t"/>
         <w:rPr>
-          <w:rFonts w:ascii="Calibri" w:hAnsi="Calibri" w:cs="Calibri"/>
-          <w:sz w:val="22"/>
-          <w:szCs w:val="22"/>
-        </w:rPr>
-      </w:pPr>
-      <w:r>
-        <w:rPr>
-          <w:rFonts w:ascii="Segoe UI Symbol" w:hAnsi="Segoe UI Symbol" w:cs="Segoe UI Symbol"/>
-          <w:sz w:val="22"/>
-          <w:szCs w:val="22"/>
-        </w:rPr>
-        <w:t>☐</w:t>
-      </w:r>
-      <w:r>
-        <w:rPr>
-          <w:rFonts w:ascii="Calibri" w:hAnsi="Calibri" w:cs="Calibri"/>
+          <w:rFonts w:ascii="Segoe UI" w:hAnsi="Segoe UI" w:cs="Segoe UI"/>
+          <w:color w:val="3D3550"/>
+          <w:sz w:val="22"/>
+          <w:szCs w:val="22"/>
+        </w:rPr>
+      </w:pPr>
+      <w:r>
+        <w:rPr>
+          <w:rFonts w:ascii="Segoe UI Symbol" w:hAnsi="Segoe UI Symbol" w:cs="Segoe UI Symbol"/>
+          <w:color w:val="3D3550"/>
+          <w:sz w:val="22"/>
+          <w:szCs w:val="22"/>
+        </w:rPr>
+        <w:t>☐</w:t>
+      </w:r>
+      <w:r>
+        <w:rPr>
+          <w:rFonts w:ascii="Segoe UI" w:hAnsi="Segoe UI" w:cs="Segoe UI"/>
+          <w:color w:val="3D3550"/>
+          <w:sz w:val="22"/>
+          <w:szCs w:val="22"/>
+        </w:rPr>
+        <w:t xml:space="preserve"> </w:t>
+      </w:r>
+      <w:r>
+        <w:rPr>
+          <w:rFonts w:ascii="Segoe UI Emoji" w:hAnsi="Segoe UI Emoji" w:cs="Segoe UI Emoji"/>
+          <w:color w:val="3D3550"/>
+          <w:sz w:val="22"/>
+          <w:szCs w:val="22"/>
+        </w:rPr>
+        <w:t>✏</w:t>
+      </w:r>
+      <w:r>
+        <w:rPr>
+          <w:rFonts w:ascii="Segoe UI Emoji" w:hAnsi="Segoe UI Emoji" w:cs="Segoe UI Emoji"/>
+          <w:color w:val="3D3550"/>
+          <w:sz w:val="22"/>
+          <w:szCs w:val="22"/>
+        </w:rPr>
+        <w:t>️</w:t>
+      </w:r>
+      <w:r>
+        <w:rPr>
+          <w:rFonts w:ascii="Segoe UI" w:hAnsi="Segoe UI" w:cs="Segoe UI"/>
+          <w:color w:val="3D3550"/>
           <w:sz w:val="22"/>
           <w:szCs w:val="22"/>
         </w:rPr>
@@ -944,22 +1432,43 @@
       <w:pPr>
         <w:pStyle w:val="t"/>
         <w:rPr>
-          <w:rFonts w:ascii="Calibri" w:hAnsi="Calibri" w:cs="Calibri"/>
-          <w:sz w:val="22"/>
-          <w:szCs w:val="22"/>
-        </w:rPr>
-      </w:pPr>
-      <w:r>
-        <w:rPr>
-          <w:rFonts w:ascii="Segoe UI Symbol" w:hAnsi="Segoe UI Symbol" w:cs="Segoe UI Symbol"/>
-          <w:sz w:val="22"/>
-          <w:szCs w:val="22"/>
-        </w:rPr>
-        <w:t>☐</w:t>
-      </w:r>
-      <w:r>
-        <w:rPr>
-          <w:rFonts w:ascii="Calibri" w:hAnsi="Calibri" w:cs="Calibri"/>
+          <w:rFonts w:ascii="Segoe UI" w:hAnsi="Segoe UI" w:cs="Segoe UI"/>
+          <w:color w:val="3D3550"/>
+          <w:sz w:val="22"/>
+          <w:szCs w:val="22"/>
+        </w:rPr>
+      </w:pPr>
+      <w:r>
+        <w:rPr>
+          <w:rFonts w:ascii="Segoe UI Symbol" w:hAnsi="Segoe UI Symbol" w:cs="Segoe UI Symbol"/>
+          <w:color w:val="3D3550"/>
+          <w:sz w:val="22"/>
+          <w:szCs w:val="22"/>
+        </w:rPr>
+        <w:t>☐</w:t>
+      </w:r>
+      <w:r>
+        <w:rPr>
+          <w:rFonts w:ascii="Segoe UI" w:hAnsi="Segoe UI" w:cs="Segoe UI"/>
+          <w:color w:val="3D3550"/>
+          <w:sz w:val="22"/>
+          <w:szCs w:val="22"/>
+        </w:rPr>
+        <w:t xml:space="preserve"> </w:t>
+      </w:r>
+      <w:r>
+        <w:rPr>
+          <w:rFonts w:ascii="Segoe UI Emoji" w:hAnsi="Segoe UI Emoji" w:cs="Segoe UI Emoji"/>
+          <w:color w:val="3D3550"/>
+          <w:sz w:val="22"/>
+          <w:szCs w:val="22"/>
+        </w:rPr>
+        <w:t>💡</w:t>
+      </w:r>
+      <w:r>
+        <w:rPr>
+          <w:rFonts w:ascii="Segoe UI" w:hAnsi="Segoe UI" w:cs="Segoe UI"/>
+          <w:color w:val="3D3550"/>
           <w:sz w:val="22"/>
           <w:szCs w:val="22"/>
         </w:rPr>
@@ -969,31 +1478,68 @@
     <w:p>
       <w:pPr>
         <w:pStyle w:val="Heading2"/>
-        <w:rPr>
-          <w:rFonts w:ascii="Calibri" w:eastAsia="Times New Roman" w:hAnsi="Calibri" w:cs="Calibri"/>
-        </w:rPr>
-      </w:pPr>
-      <w:r>
-        <w:rPr>
-          <w:rFonts w:ascii="Calibri" w:eastAsia="Times New Roman" w:hAnsi="Calibri" w:cs="Calibri"/>
-        </w:rPr>
-        <w:t>Suggested schedule</w:t>
-      </w:r>
-    </w:p>
-    <w:p>
-      <w:pPr>
-        <w:pStyle w:val="t"/>
-        <w:rPr>
-          <w:rFonts w:ascii="Calibri" w:hAnsi="Calibri" w:cs="Calibri"/>
-          <w:sz w:val="22"/>
-          <w:szCs w:val="22"/>
-        </w:rPr>
-      </w:pPr>
-      <w:r>
-        <w:rPr>
-          <w:rFonts w:ascii="Calibri" w:hAnsi="Calibri" w:cs="Calibri"/>
+        <w:shd w:val="clear" w:color="auto" w:fill="F3E3F7"/>
+        <w:rPr>
+          <w:rFonts w:ascii="Segoe UI" w:eastAsia="Times New Roman" w:hAnsi="Segoe UI" w:cs="Segoe UI"/>
+          <w:color w:val="8E3FA8"/>
+        </w:rPr>
+      </w:pPr>
+      <w:r>
+        <w:rPr>
+          <w:rFonts w:ascii="Segoe UI Emoji" w:eastAsia="Times New Roman" w:hAnsi="Segoe UI Emoji" w:cs="Segoe UI Emoji"/>
+          <w:color w:val="8E3FA8"/>
+        </w:rPr>
+        <w:t>🗓</w:t>
+      </w:r>
+      <w:r>
+        <w:rPr>
+          <w:rFonts w:ascii="Segoe UI Emoji" w:eastAsia="Times New Roman" w:hAnsi="Segoe UI Emoji" w:cs="Segoe UI Emoji"/>
+          <w:color w:val="8E3FA8"/>
+        </w:rPr>
+        <w:t>️</w:t>
+      </w:r>
+      <w:r>
+        <w:rPr>
+          <w:rFonts w:ascii="Segoe UI" w:eastAsia="Times New Roman" w:hAnsi="Segoe UI" w:cs="Segoe UI"/>
+          <w:color w:val="8E3FA8"/>
+        </w:rPr>
+        <w:t xml:space="preserve"> Suggested schedule</w:t>
+      </w:r>
+    </w:p>
+    <w:p>
+      <w:pPr>
+        <w:pStyle w:val="t"/>
+        <w:rPr>
+          <w:rFonts w:ascii="Segoe UI" w:hAnsi="Segoe UI" w:cs="Segoe UI"/>
+          <w:color w:val="3D3550"/>
+          <w:sz w:val="22"/>
+          <w:szCs w:val="22"/>
+        </w:rPr>
+      </w:pPr>
+      <w:r>
+        <w:rPr>
+          <w:rFonts w:ascii="Segoe UI Emoji" w:hAnsi="Segoe UI Emoji" w:cs="Segoe UI Emoji"/>
+          <w:color w:val="3D3550"/>
+          <w:sz w:val="22"/>
+          <w:szCs w:val="22"/>
+        </w:rPr>
+        <w:t>🌱</w:t>
+      </w:r>
+      <w:r>
+        <w:rPr>
+          <w:rFonts w:ascii="Segoe UI" w:hAnsi="Segoe UI" w:cs="Segoe UI"/>
+          <w:color w:val="3D3550"/>
+          <w:sz w:val="22"/>
+          <w:szCs w:val="22"/>
+        </w:rPr>
+        <w:t xml:space="preserve"> </w:t>
+      </w:r>
+      <w:r>
+        <w:rPr>
+          <w:rFonts w:ascii="Segoe UI" w:hAnsi="Segoe UI" w:cs="Segoe UI"/>
           <w:b/>
           <w:bCs/>
+          <w:color w:val="3D3550"/>
           <w:sz w:val="22"/>
           <w:szCs w:val="22"/>
         </w:rPr>
@@ -1001,7 +1547,8 @@
       </w:r>
       <w:r>
         <w:rPr>
-          <w:rFonts w:ascii="Calibri" w:hAnsi="Calibri" w:cs="Calibri"/>
+          <w:rFonts w:ascii="Segoe UI" w:hAnsi="Segoe UI" w:cs="Segoe UI"/>
+          <w:color w:val="3D3550"/>
           <w:sz w:val="22"/>
           <w:szCs w:val="22"/>
         </w:rPr>
@@ -1012,16 +1559,36 @@
       <w:pPr>
         <w:pStyle w:val="t"/>
         <w:rPr>
-          <w:rFonts w:ascii="Calibri" w:hAnsi="Calibri" w:cs="Calibri"/>
-          <w:sz w:val="22"/>
-          <w:szCs w:val="22"/>
-        </w:rPr>
-      </w:pPr>
-      <w:r>
-        <w:rPr>
-          <w:rFonts w:ascii="Calibri" w:hAnsi="Calibri" w:cs="Calibri"/>
+          <w:rFonts w:ascii="Segoe UI" w:hAnsi="Segoe UI" w:cs="Segoe UI"/>
+          <w:color w:val="3D3550"/>
+          <w:sz w:val="22"/>
+          <w:szCs w:val="22"/>
+        </w:rPr>
+      </w:pPr>
+      <w:r>
+        <w:rPr>
+          <w:rFonts w:ascii="Segoe UI Emoji" w:hAnsi="Segoe UI Emoji" w:cs="Segoe UI Emoji"/>
+          <w:color w:val="3D3550"/>
+          <w:sz w:val="22"/>
+          <w:szCs w:val="22"/>
+        </w:rPr>
+        <w:t>🌷</w:t>
+      </w:r>
+      <w:r>
+        <w:rPr>
+          <w:rFonts w:ascii="Segoe UI" w:hAnsi="Segoe UI" w:cs="Segoe UI"/>
+          <w:color w:val="3D3550"/>
+          <w:sz w:val="22"/>
+          <w:szCs w:val="22"/>
+        </w:rPr>
+        <w:t xml:space="preserve"> </w:t>
+      </w:r>
+      <w:r>
+        <w:rPr>
+          <w:rFonts w:ascii="Segoe UI" w:hAnsi="Segoe UI" w:cs="Segoe UI"/>
           <w:b/>
           <w:bCs/>
+          <w:color w:val="3D3550"/>
           <w:sz w:val="22"/>
           <w:szCs w:val="22"/>
         </w:rPr>
@@ -1029,7 +1596,8 @@
       </w:r>
       <w:r>
         <w:rPr>
-          <w:rFonts w:ascii="Calibri" w:hAnsi="Calibri" w:cs="Calibri"/>
+          <w:rFonts w:ascii="Segoe UI" w:hAnsi="Segoe UI" w:cs="Segoe UI"/>
+          <w:color w:val="3D3550"/>
           <w:sz w:val="22"/>
           <w:szCs w:val="22"/>
         </w:rPr>
@@ -1040,16 +1608,36 @@
       <w:pPr>
         <w:pStyle w:val="t"/>
         <w:rPr>
-          <w:rFonts w:ascii="Calibri" w:hAnsi="Calibri" w:cs="Calibri"/>
-          <w:sz w:val="22"/>
-          <w:szCs w:val="22"/>
-        </w:rPr>
-      </w:pPr>
-      <w:r>
-        <w:rPr>
-          <w:rFonts w:ascii="Calibri" w:hAnsi="Calibri" w:cs="Calibri"/>
+          <w:rFonts w:ascii="Segoe UI" w:hAnsi="Segoe UI" w:cs="Segoe UI"/>
+          <w:color w:val="3D3550"/>
+          <w:sz w:val="22"/>
+          <w:szCs w:val="22"/>
+        </w:rPr>
+      </w:pPr>
+      <w:r>
+        <w:rPr>
+          <w:rFonts w:ascii="Segoe UI Emoji" w:hAnsi="Segoe UI Emoji" w:cs="Segoe UI Emoji"/>
+          <w:color w:val="3D3550"/>
+          <w:sz w:val="22"/>
+          <w:szCs w:val="22"/>
+        </w:rPr>
+        <w:t>🌻</w:t>
+      </w:r>
+      <w:r>
+        <w:rPr>
+          <w:rFonts w:ascii="Segoe UI" w:hAnsi="Segoe UI" w:cs="Segoe UI"/>
+          <w:color w:val="3D3550"/>
+          <w:sz w:val="22"/>
+          <w:szCs w:val="22"/>
+        </w:rPr>
+        <w:t xml:space="preserve"> </w:t>
+      </w:r>
+      <w:r>
+        <w:rPr>
+          <w:rFonts w:ascii="Segoe UI" w:hAnsi="Segoe UI" w:cs="Segoe UI"/>
           <w:b/>
           <w:bCs/>
+          <w:color w:val="3D3550"/>
           <w:sz w:val="22"/>
           <w:szCs w:val="22"/>
         </w:rPr>
@@ -1057,7 +1645,8 @@
       </w:r>
       <w:r>
         <w:rPr>
-          <w:rFonts w:ascii="Calibri" w:hAnsi="Calibri" w:cs="Calibri"/>
+          <w:rFonts w:ascii="Segoe UI" w:hAnsi="Segoe UI" w:cs="Segoe UI"/>
+          <w:color w:val="3D3550"/>
           <w:sz w:val="22"/>
           <w:szCs w:val="22"/>
         </w:rPr>
@@ -1068,16 +1657,36 @@
       <w:pPr>
         <w:pStyle w:val="t"/>
         <w:rPr>
-          <w:rFonts w:ascii="Calibri" w:hAnsi="Calibri" w:cs="Calibri"/>
-          <w:sz w:val="22"/>
-          <w:szCs w:val="22"/>
-        </w:rPr>
-      </w:pPr>
-      <w:r>
-        <w:rPr>
-          <w:rFonts w:ascii="Calibri" w:hAnsi="Calibri" w:cs="Calibri"/>
+          <w:rFonts w:ascii="Segoe UI" w:hAnsi="Segoe UI" w:cs="Segoe UI"/>
+          <w:color w:val="3D3550"/>
+          <w:sz w:val="22"/>
+          <w:szCs w:val="22"/>
+        </w:rPr>
+      </w:pPr>
+      <w:r>
+        <w:rPr>
+          <w:rFonts w:ascii="Segoe UI Emoji" w:hAnsi="Segoe UI Emoji" w:cs="Segoe UI Emoji"/>
+          <w:color w:val="3D3550"/>
+          <w:sz w:val="22"/>
+          <w:szCs w:val="22"/>
+        </w:rPr>
+        <w:t>🍀</w:t>
+      </w:r>
+      <w:r>
+        <w:rPr>
+          <w:rFonts w:ascii="Segoe UI" w:hAnsi="Segoe UI" w:cs="Segoe UI"/>
+          <w:color w:val="3D3550"/>
+          <w:sz w:val="22"/>
+          <w:szCs w:val="22"/>
+        </w:rPr>
+        <w:t xml:space="preserve"> </w:t>
+      </w:r>
+      <w:r>
+        <w:rPr>
+          <w:rFonts w:ascii="Segoe UI" w:hAnsi="Segoe UI" w:cs="Segoe UI"/>
           <w:b/>
           <w:bCs/>
+          <w:color w:val="3D3550"/>
           <w:sz w:val="22"/>
           <w:szCs w:val="22"/>
         </w:rPr>
@@ -1085,7 +1694,8 @@
       </w:r>
       <w:r>
         <w:rPr>
-          <w:rFonts w:ascii="Calibri" w:hAnsi="Calibri" w:cs="Calibri"/>
+          <w:rFonts w:ascii="Segoe UI" w:hAnsi="Segoe UI" w:cs="Segoe UI"/>
+          <w:color w:val="3D3550"/>
           <w:sz w:val="22"/>
           <w:szCs w:val="22"/>
         </w:rPr>
@@ -1096,16 +1706,36 @@
       <w:pPr>
         <w:pStyle w:val="t"/>
         <w:rPr>
-          <w:rFonts w:ascii="Calibri" w:hAnsi="Calibri" w:cs="Calibri"/>
-          <w:sz w:val="22"/>
-          <w:szCs w:val="22"/>
-        </w:rPr>
-      </w:pPr>
-      <w:r>
-        <w:rPr>
-          <w:rFonts w:ascii="Calibri" w:hAnsi="Calibri" w:cs="Calibri"/>
+          <w:rFonts w:ascii="Segoe UI" w:hAnsi="Segoe UI" w:cs="Segoe UI"/>
+          <w:color w:val="3D3550"/>
+          <w:sz w:val="22"/>
+          <w:szCs w:val="22"/>
+        </w:rPr>
+      </w:pPr>
+      <w:r>
+        <w:rPr>
+          <w:rFonts w:ascii="Segoe UI Emoji" w:hAnsi="Segoe UI Emoji" w:cs="Segoe UI Emoji"/>
+          <w:color w:val="3D3550"/>
+          <w:sz w:val="22"/>
+          <w:szCs w:val="22"/>
+        </w:rPr>
+        <w:t>🎉</w:t>
+      </w:r>
+      <w:r>
+        <w:rPr>
+          <w:rFonts w:ascii="Segoe UI" w:hAnsi="Segoe UI" w:cs="Segoe UI"/>
+          <w:color w:val="3D3550"/>
+          <w:sz w:val="22"/>
+          <w:szCs w:val="22"/>
+        </w:rPr>
+        <w:t xml:space="preserve"> </w:t>
+      </w:r>
+      <w:r>
+        <w:rPr>
+          <w:rFonts w:ascii="Segoe UI" w:hAnsi="Segoe UI" w:cs="Segoe UI"/>
           <w:b/>
           <w:bCs/>
+          <w:color w:val="3D3550"/>
           <w:sz w:val="22"/>
           <w:szCs w:val="22"/>
         </w:rPr>
@@ -1113,7 +1743,8 @@
       </w:r>
       <w:r>
         <w:rPr>
-          <w:rFonts w:ascii="Calibri" w:hAnsi="Calibri" w:cs="Calibri"/>
+          <w:rFonts w:ascii="Segoe UI" w:hAnsi="Segoe UI" w:cs="Segoe UI"/>
+          <w:color w:val="3D3550"/>
           <w:sz w:val="22"/>
           <w:szCs w:val="22"/>
         </w:rPr>
@@ -1541,10 +2172,10 @@
     <w:rPr>
       <w:b/>
       <w:bCs/>
-      <w:color w:val="1F3864"/>
+      <w:color w:val="8E5BB5"/>
       <w:kern w:val="36"/>
-      <w:sz w:val="36"/>
-      <w:szCs w:val="36"/>
+      <w:sz w:val="44"/>
+      <w:szCs w:val="44"/>
     </w:rPr>
   </w:style>
   <w:style w:type="paragraph" w:styleId="Heading2">
@@ -1554,13 +2185,12 @@
     <w:uiPriority w:val="9"/>
     <w:qFormat/>
     <w:pPr>
-      <w:spacing w:before="280" w:after="80"/>
+      <w:spacing w:before="280" w:after="100"/>
       <w:outlineLvl w:val="1"/>
     </w:pPr>
     <w:rPr>
       <w:b/>
       <w:bCs/>
-      <w:color w:val="2F5496"/>
       <w:sz w:val="26"/>
       <w:szCs w:val="26"/>
     </w:rPr>
@@ -1628,9 +2258,21 @@
     <w:name w:val="t"/>
     <w:basedOn w:val="Normal"/>
     <w:pPr>
-      <w:spacing w:after="60"/>
-      <w:ind w:left="360"/>
+      <w:spacing w:after="80"/>
+      <w:ind w:left="440"/>
     </w:pPr>
+  </w:style>
+  <w:style w:type="paragraph" w:customStyle="1" w:styleId="tag">
+    <w:name w:val="tag"/>
+    <w:basedOn w:val="Normal"/>
+    <w:pPr>
+      <w:spacing w:after="100" w:afterAutospacing="1"/>
+    </w:pPr>
+    <w:rPr>
+      <w:i/>
+      <w:iCs/>
+      <w:color w:val="B07CC6"/>
+    </w:rPr>
   </w:style>
   <w:style w:type="paragraph" w:customStyle="1" w:styleId="sub">
     <w:name w:val="sub"/>
@@ -1639,7 +2281,97 @@
       <w:spacing w:before="100" w:beforeAutospacing="1" w:after="100" w:afterAutospacing="1"/>
     </w:pPr>
     <w:rPr>
-      <w:color w:val="666666"/>
+      <w:color w:val="9A8FAE"/>
+      <w:sz w:val="21"/>
+      <w:szCs w:val="21"/>
+    </w:rPr>
+  </w:style>
+  <w:style w:type="paragraph" w:customStyle="1" w:styleId="c1">
+    <w:name w:val="c1"/>
+    <w:basedOn w:val="Normal"/>
+    <w:pPr>
+      <w:shd w:val="clear" w:color="auto" w:fill="FDE2EC"/>
+      <w:spacing w:before="100" w:beforeAutospacing="1" w:after="100" w:afterAutospacing="1"/>
+    </w:pPr>
+    <w:rPr>
+      <w:color w:val="C2185B"/>
+    </w:rPr>
+  </w:style>
+  <w:style w:type="paragraph" w:customStyle="1" w:styleId="c2">
+    <w:name w:val="c2"/>
+    <w:basedOn w:val="Normal"/>
+    <w:pPr>
+      <w:shd w:val="clear" w:color="auto" w:fill="FFF1D6"/>
+      <w:spacing w:before="100" w:beforeAutospacing="1" w:after="100" w:afterAutospacing="1"/>
+    </w:pPr>
+    <w:rPr>
+      <w:color w:val="C77700"/>
+    </w:rPr>
+  </w:style>
+  <w:style w:type="paragraph" w:customStyle="1" w:styleId="c3">
+    <w:name w:val="c3"/>
+    <w:basedOn w:val="Normal"/>
+    <w:pPr>
+      <w:shd w:val="clear" w:color="auto" w:fill="E3F4E8"/>
+      <w:spacing w:before="100" w:beforeAutospacing="1" w:after="100" w:afterAutospacing="1"/>
+    </w:pPr>
+    <w:rPr>
+      <w:color w:val="2E7D4F"/>
+    </w:rPr>
+  </w:style>
+  <w:style w:type="paragraph" w:customStyle="1" w:styleId="c4">
+    <w:name w:val="c4"/>
+    <w:basedOn w:val="Normal"/>
+    <w:pPr>
+      <w:shd w:val="clear" w:color="auto" w:fill="E1EEFB"/>
+      <w:spacing w:before="100" w:beforeAutospacing="1" w:after="100" w:afterAutospacing="1"/>
+    </w:pPr>
+    <w:rPr>
+      <w:color w:val="2563A8"/>
+    </w:rPr>
+  </w:style>
+  <w:style w:type="paragraph" w:customStyle="1" w:styleId="c5">
+    <w:name w:val="c5"/>
+    <w:basedOn w:val="Normal"/>
+    <w:pPr>
+      <w:shd w:val="clear" w:color="auto" w:fill="EDE4FA"/>
+      <w:spacing w:before="100" w:beforeAutospacing="1" w:after="100" w:afterAutospacing="1"/>
+    </w:pPr>
+    <w:rPr>
+      <w:color w:val="6A3FB0"/>
+    </w:rPr>
+  </w:style>
+  <w:style w:type="paragraph" w:customStyle="1" w:styleId="c6">
+    <w:name w:val="c6"/>
+    <w:basedOn w:val="Normal"/>
+    <w:pPr>
+      <w:shd w:val="clear" w:color="auto" w:fill="DFF5F5"/>
+      <w:spacing w:before="100" w:beforeAutospacing="1" w:after="100" w:afterAutospacing="1"/>
+    </w:pPr>
+    <w:rPr>
+      <w:color w:val="157A7A"/>
+    </w:rPr>
+  </w:style>
+  <w:style w:type="paragraph" w:customStyle="1" w:styleId="c7">
+    <w:name w:val="c7"/>
+    <w:basedOn w:val="Normal"/>
+    <w:pPr>
+      <w:shd w:val="clear" w:color="auto" w:fill="FCE8DD"/>
+      <w:spacing w:before="100" w:beforeAutospacing="1" w:after="100" w:afterAutospacing="1"/>
+    </w:pPr>
+    <w:rPr>
+      <w:color w:val="B4532A"/>
+    </w:rPr>
+  </w:style>
+  <w:style w:type="paragraph" w:customStyle="1" w:styleId="c8">
+    <w:name w:val="c8"/>
+    <w:basedOn w:val="Normal"/>
+    <w:pPr>
+      <w:shd w:val="clear" w:color="auto" w:fill="F3E3F7"/>
+      <w:spacing w:before="100" w:beforeAutospacing="1" w:after="100" w:afterAutospacing="1"/>
+    </w:pPr>
+    <w:rPr>
+      <w:color w:val="8E3FA8"/>
     </w:rPr>
   </w:style>
   <w:style w:type="character" w:customStyle="1" w:styleId="sub1">
@@ -1648,7 +2380,9 @@
     <w:rPr>
       <w:b w:val="0"/>
       <w:bCs w:val="0"/>
-      <w:color w:val="666666"/>
+      <w:color w:val="9A8FAE"/>
+      <w:sz w:val="21"/>
+      <w:szCs w:val="21"/>
     </w:rPr>
   </w:style>
 </w:styles>

</xml_diff>